<commit_message>
Rebuild PRD.docx with Table Grid style for Google Docs compatibility
</commit_message>
<xml_diff>
--- a/PRD.docx
+++ b/PRD.docx
@@ -4,7 +4,7 @@
   <w:body>
     <w:p>
       <w:pPr>
-        <w:pStyle w:val="Title"/>
+        <w:pStyle w:val="Heading1"/>
       </w:pPr>
       <w:r>
         <w:t>Closed-Won Contract Audit — Product &amp; Design Doc (PRD)</w:t>
@@ -64,16 +64,8 @@
       </w:r>
     </w:p>
     <w:p>
-      <w:r>
-        <w:rPr>
-          <w:color w:val="BBBBBB"/>
-        </w:rPr>
-        <w:t>________________________________________</w:t>
-      </w:r>
-    </w:p>
-    <w:p>
       <w:pPr>
-        <w:pStyle w:val="Heading1"/>
+        <w:pStyle w:val="Heading2"/>
       </w:pPr>
       <w:r>
         <w:t>1. Purpose</w:t>
@@ -211,16 +203,8 @@
       </w:r>
     </w:p>
     <w:p>
-      <w:r>
-        <w:rPr>
-          <w:color w:val="BBBBBB"/>
-        </w:rPr>
-        <w:t>________________________________________</w:t>
-      </w:r>
-    </w:p>
-    <w:p>
       <w:pPr>
-        <w:pStyle w:val="Heading1"/>
+        <w:pStyle w:val="Heading2"/>
       </w:pPr>
       <w:r>
         <w:t>2. Current architecture (as operated today)</w:t>
@@ -287,7 +271,7 @@
     </w:p>
     <w:tbl>
       <w:tblPr>
-        <w:tblStyle w:val="LightGrid-Accent1"/>
+        <w:tblStyle w:val="TableGrid"/>
         <w:tblW w:type="auto" w:w="0"/>
         <w:tblLook w:firstColumn="1" w:firstRow="1" w:lastColumn="0" w:lastRow="0" w:noHBand="0" w:noVBand="1" w:val="04A0"/>
       </w:tblPr>
@@ -300,6 +284,12 @@
         <w:tc>
           <w:tcPr>
             <w:tcW w:type="dxa" w:w="2880"/>
+            <w:tcBorders>
+              <w:top w:val="single" w:sz="4" w:color="999999"/>
+              <w:left w:val="single" w:sz="4" w:color="999999"/>
+              <w:bottom w:val="single" w:sz="4" w:color="999999"/>
+              <w:right w:val="single" w:sz="4" w:color="999999"/>
+            </w:tcBorders>
           </w:tcPr>
           <w:p>
             <w:r>
@@ -318,6 +308,12 @@
         <w:tc>
           <w:tcPr>
             <w:tcW w:type="dxa" w:w="2880"/>
+            <w:tcBorders>
+              <w:top w:val="single" w:sz="4" w:color="999999"/>
+              <w:left w:val="single" w:sz="4" w:color="999999"/>
+              <w:bottom w:val="single" w:sz="4" w:color="999999"/>
+              <w:right w:val="single" w:sz="4" w:color="999999"/>
+            </w:tcBorders>
           </w:tcPr>
           <w:p>
             <w:r>
@@ -336,6 +332,12 @@
         <w:tc>
           <w:tcPr>
             <w:tcW w:type="dxa" w:w="2880"/>
+            <w:tcBorders>
+              <w:top w:val="single" w:sz="4" w:color="999999"/>
+              <w:left w:val="single" w:sz="4" w:color="999999"/>
+              <w:bottom w:val="single" w:sz="4" w:color="999999"/>
+              <w:right w:val="single" w:sz="4" w:color="999999"/>
+            </w:tcBorders>
           </w:tcPr>
           <w:p>
             <w:r>
@@ -356,6 +358,12 @@
         <w:tc>
           <w:tcPr>
             <w:tcW w:type="dxa" w:w="2880"/>
+            <w:tcBorders>
+              <w:top w:val="single" w:sz="4" w:color="999999"/>
+              <w:left w:val="single" w:sz="4" w:color="999999"/>
+              <w:bottom w:val="single" w:sz="4" w:color="999999"/>
+              <w:right w:val="single" w:sz="4" w:color="999999"/>
+            </w:tcBorders>
           </w:tcPr>
           <w:p>
             <w:r/>
@@ -370,6 +378,12 @@
         <w:tc>
           <w:tcPr>
             <w:tcW w:type="dxa" w:w="2880"/>
+            <w:tcBorders>
+              <w:top w:val="single" w:sz="4" w:color="999999"/>
+              <w:left w:val="single" w:sz="4" w:color="999999"/>
+              <w:bottom w:val="single" w:sz="4" w:color="999999"/>
+              <w:right w:val="single" w:sz="4" w:color="999999"/>
+            </w:tcBorders>
           </w:tcPr>
           <w:p>
             <w:r/>
@@ -381,6 +395,12 @@
         <w:tc>
           <w:tcPr>
             <w:tcW w:type="dxa" w:w="2880"/>
+            <w:tcBorders>
+              <w:top w:val="single" w:sz="4" w:color="999999"/>
+              <w:left w:val="single" w:sz="4" w:color="999999"/>
+              <w:bottom w:val="single" w:sz="4" w:color="999999"/>
+              <w:right w:val="single" w:sz="4" w:color="999999"/>
+            </w:tcBorders>
           </w:tcPr>
           <w:p>
             <w:r/>
@@ -403,6 +423,12 @@
         <w:tc>
           <w:tcPr>
             <w:tcW w:type="dxa" w:w="2880"/>
+            <w:tcBorders>
+              <w:top w:val="single" w:sz="4" w:color="999999"/>
+              <w:left w:val="single" w:sz="4" w:color="999999"/>
+              <w:bottom w:val="single" w:sz="4" w:color="999999"/>
+              <w:right w:val="single" w:sz="4" w:color="999999"/>
+            </w:tcBorders>
           </w:tcPr>
           <w:p>
             <w:r/>
@@ -417,6 +443,12 @@
         <w:tc>
           <w:tcPr>
             <w:tcW w:type="dxa" w:w="2880"/>
+            <w:tcBorders>
+              <w:top w:val="single" w:sz="4" w:color="999999"/>
+              <w:left w:val="single" w:sz="4" w:color="999999"/>
+              <w:bottom w:val="single" w:sz="4" w:color="999999"/>
+              <w:right w:val="single" w:sz="4" w:color="999999"/>
+            </w:tcBorders>
           </w:tcPr>
           <w:p>
             <w:r/>
@@ -428,6 +460,12 @@
         <w:tc>
           <w:tcPr>
             <w:tcW w:type="dxa" w:w="2880"/>
+            <w:tcBorders>
+              <w:top w:val="single" w:sz="4" w:color="999999"/>
+              <w:left w:val="single" w:sz="4" w:color="999999"/>
+              <w:bottom w:val="single" w:sz="4" w:color="999999"/>
+              <w:right w:val="single" w:sz="4" w:color="999999"/>
+            </w:tcBorders>
           </w:tcPr>
           <w:p>
             <w:r/>
@@ -451,6 +489,12 @@
         <w:tc>
           <w:tcPr>
             <w:tcW w:type="dxa" w:w="2880"/>
+            <w:tcBorders>
+              <w:top w:val="single" w:sz="4" w:color="999999"/>
+              <w:left w:val="single" w:sz="4" w:color="999999"/>
+              <w:bottom w:val="single" w:sz="4" w:color="999999"/>
+              <w:right w:val="single" w:sz="4" w:color="999999"/>
+            </w:tcBorders>
           </w:tcPr>
           <w:p>
             <w:r/>
@@ -465,6 +509,12 @@
         <w:tc>
           <w:tcPr>
             <w:tcW w:type="dxa" w:w="2880"/>
+            <w:tcBorders>
+              <w:top w:val="single" w:sz="4" w:color="999999"/>
+              <w:left w:val="single" w:sz="4" w:color="999999"/>
+              <w:bottom w:val="single" w:sz="4" w:color="999999"/>
+              <w:right w:val="single" w:sz="4" w:color="999999"/>
+            </w:tcBorders>
           </w:tcPr>
           <w:p>
             <w:r/>
@@ -493,6 +543,12 @@
         <w:tc>
           <w:tcPr>
             <w:tcW w:type="dxa" w:w="2880"/>
+            <w:tcBorders>
+              <w:top w:val="single" w:sz="4" w:color="999999"/>
+              <w:left w:val="single" w:sz="4" w:color="999999"/>
+              <w:bottom w:val="single" w:sz="4" w:color="999999"/>
+              <w:right w:val="single" w:sz="4" w:color="999999"/>
+            </w:tcBorders>
           </w:tcPr>
           <w:p>
             <w:r/>
@@ -523,6 +579,12 @@
         <w:tc>
           <w:tcPr>
             <w:tcW w:type="dxa" w:w="2880"/>
+            <w:tcBorders>
+              <w:top w:val="single" w:sz="4" w:color="999999"/>
+              <w:left w:val="single" w:sz="4" w:color="999999"/>
+              <w:bottom w:val="single" w:sz="4" w:color="999999"/>
+              <w:right w:val="single" w:sz="4" w:color="999999"/>
+            </w:tcBorders>
           </w:tcPr>
           <w:p>
             <w:r/>
@@ -537,6 +599,12 @@
         <w:tc>
           <w:tcPr>
             <w:tcW w:type="dxa" w:w="2880"/>
+            <w:tcBorders>
+              <w:top w:val="single" w:sz="4" w:color="999999"/>
+              <w:left w:val="single" w:sz="4" w:color="999999"/>
+              <w:bottom w:val="single" w:sz="4" w:color="999999"/>
+              <w:right w:val="single" w:sz="4" w:color="999999"/>
+            </w:tcBorders>
           </w:tcPr>
           <w:p>
             <w:r/>
@@ -548,6 +616,12 @@
         <w:tc>
           <w:tcPr>
             <w:tcW w:type="dxa" w:w="2880"/>
+            <w:tcBorders>
+              <w:top w:val="single" w:sz="4" w:color="999999"/>
+              <w:left w:val="single" w:sz="4" w:color="999999"/>
+              <w:bottom w:val="single" w:sz="4" w:color="999999"/>
+              <w:right w:val="single" w:sz="4" w:color="999999"/>
+            </w:tcBorders>
           </w:tcPr>
           <w:p>
             <w:r/>
@@ -581,6 +655,12 @@
         <w:tc>
           <w:tcPr>
             <w:tcW w:type="dxa" w:w="2880"/>
+            <w:tcBorders>
+              <w:top w:val="single" w:sz="4" w:color="999999"/>
+              <w:left w:val="single" w:sz="4" w:color="999999"/>
+              <w:bottom w:val="single" w:sz="4" w:color="999999"/>
+              <w:right w:val="single" w:sz="4" w:color="999999"/>
+            </w:tcBorders>
           </w:tcPr>
           <w:p>
             <w:r/>
@@ -595,6 +675,12 @@
         <w:tc>
           <w:tcPr>
             <w:tcW w:type="dxa" w:w="2880"/>
+            <w:tcBorders>
+              <w:top w:val="single" w:sz="4" w:color="999999"/>
+              <w:left w:val="single" w:sz="4" w:color="999999"/>
+              <w:bottom w:val="single" w:sz="4" w:color="999999"/>
+              <w:right w:val="single" w:sz="4" w:color="999999"/>
+            </w:tcBorders>
           </w:tcPr>
           <w:p>
             <w:r/>
@@ -606,6 +692,12 @@
         <w:tc>
           <w:tcPr>
             <w:tcW w:type="dxa" w:w="2880"/>
+            <w:tcBorders>
+              <w:top w:val="single" w:sz="4" w:color="999999"/>
+              <w:left w:val="single" w:sz="4" w:color="999999"/>
+              <w:bottom w:val="single" w:sz="4" w:color="999999"/>
+              <w:right w:val="single" w:sz="4" w:color="999999"/>
+            </w:tcBorders>
           </w:tcPr>
           <w:p>
             <w:r/>
@@ -695,19 +787,463 @@
       </w:r>
     </w:p>
     <w:p>
-      <w:r>
-        <w:rPr>
-          <w:color w:val="BBBBBB"/>
-        </w:rPr>
-        <w:t>________________________________________</w:t>
+      <w:pPr>
+        <w:pStyle w:val="Heading2"/>
+      </w:pPr>
+      <w:r>
+        <w:t>3. Inputs &amp; data model</w:t>
       </w:r>
     </w:p>
     <w:p>
       <w:pPr>
-        <w:pStyle w:val="Heading1"/>
+        <w:pStyle w:val="Heading3"/>
       </w:pPr>
       <w:r>
-        <w:t>3. Inputs &amp; data model</w:t>
+        <w:t>Salesforce — Opportunity (header)</w:t>
+      </w:r>
+    </w:p>
+    <w:p>
+      <w:r>
+        <w:t>`Id, Name, Type, StageName, CloseDate, AccountId, Account.Name, Owner.Name,</w:t>
+      </w:r>
+    </w:p>
+    <w:p>
+      <w:r>
+        <w:t>Shop_ID__c, Start_Date__c, DocuSign_End_Date__c, Opt_Out__c, Opt_Out_Date__c,</w:t>
+      </w:r>
+    </w:p>
+    <w:p>
+      <w:r>
+        <w:t>Minimum_Spend__c`</w:t>
+      </w:r>
+    </w:p>
+    <w:p>
+      <w:pPr>
+        <w:pStyle w:val="Heading3"/>
+      </w:pPr>
+      <w:r>
+        <w:t>Salesforce — OpportunityLineItem</w:t>
+      </w:r>
+    </w:p>
+    <w:p>
+      <w:r>
+        <w:rPr>
+          <w:rFonts w:ascii="Consolas" w:hAnsi="Consolas"/>
+          <w:sz w:val="19"/>
+        </w:rPr>
+        <w:t>Product2.Name, Package_Type__c, Platform_Fee__c, Number_Of_Months__c, UnitPrice</w:t>
+      </w:r>
+    </w:p>
+    <w:p>
+      <w:pPr>
+        <w:pStyle w:val="Heading3"/>
+      </w:pPr>
+      <w:r>
+        <w:t>Field gotchas (trust these over labels — learned from the live org)</w:t>
+      </w:r>
+    </w:p>
+    <w:p>
+      <w:pPr>
+        <w:pStyle w:val="ListBullet"/>
+      </w:pPr>
+      <w:r>
+        <w:rPr>
+          <w:b/>
+        </w:rPr>
+        <w:t>Dates:</w:t>
+      </w:r>
+      <w:r>
+        <w:t xml:space="preserve"> use </w:t>
+      </w:r>
+      <w:r>
+        <w:rPr>
+          <w:rFonts w:ascii="Consolas" w:hAnsi="Consolas"/>
+          <w:sz w:val="19"/>
+        </w:rPr>
+        <w:t>Start_Date__c</w:t>
+      </w:r>
+      <w:r>
+        <w:t xml:space="preserve"> (label "Contract Start Date") and</w:t>
+      </w:r>
+    </w:p>
+    <w:p>
+      <w:r>
+        <w:t xml:space="preserve">  </w:t>
+      </w:r>
+      <w:r>
+        <w:rPr>
+          <w:rFonts w:ascii="Consolas" w:hAnsi="Consolas"/>
+          <w:sz w:val="19"/>
+        </w:rPr>
+        <w:t>DocuSign_End_Date__c</w:t>
+      </w:r>
+      <w:r>
+        <w:t xml:space="preserve"> (label "Contract End Date"). The fields</w:t>
+      </w:r>
+    </w:p>
+    <w:p>
+      <w:r>
+        <w:t xml:space="preserve">  </w:t>
+      </w:r>
+      <w:r>
+        <w:rPr>
+          <w:rFonts w:ascii="Consolas" w:hAnsi="Consolas"/>
+          <w:sz w:val="19"/>
+        </w:rPr>
+        <w:t>Contract_Start_Date__c</w:t>
+      </w:r>
+      <w:r>
+        <w:t xml:space="preserve"> / </w:t>
+      </w:r>
+      <w:r>
+        <w:rPr>
+          <w:rFonts w:ascii="Consolas" w:hAnsi="Consolas"/>
+          <w:sz w:val="19"/>
+        </w:rPr>
+        <w:t>Contract_End_Date__c</w:t>
+      </w:r>
+      <w:r>
+        <w:t xml:space="preserve"> are </w:t>
+      </w:r>
+      <w:r>
+        <w:rPr>
+          <w:b/>
+        </w:rPr>
+        <w:t>deprecated</w:t>
+      </w:r>
+      <w:r>
+        <w:t xml:space="preserve"> — never use.</w:t>
+      </w:r>
+    </w:p>
+    <w:p>
+      <w:pPr>
+        <w:pStyle w:val="ListBullet"/>
+      </w:pPr>
+      <w:r>
+        <w:rPr>
+          <w:b/>
+        </w:rPr>
+        <w:t>Line-item "Monthly Fee"</w:t>
+      </w:r>
+      <w:r>
+        <w:t xml:space="preserve"> is API name </w:t>
+      </w:r>
+      <w:r>
+        <w:rPr>
+          <w:rFonts w:ascii="Consolas" w:hAnsi="Consolas"/>
+          <w:sz w:val="19"/>
+        </w:rPr>
+        <w:t>Platform_Fee__c</w:t>
+      </w:r>
+      <w:r>
+        <w:t xml:space="preserve"> (label/API mismatch).</w:t>
+      </w:r>
+    </w:p>
+    <w:p>
+      <w:r>
+        <w:t xml:space="preserve">  Do </w:t>
+      </w:r>
+      <w:r>
+        <w:rPr>
+          <w:b/>
+        </w:rPr>
+        <w:t>not</w:t>
+      </w:r>
+      <w:r>
+        <w:t xml:space="preserve"> use </w:t>
+      </w:r>
+      <w:r>
+        <w:rPr>
+          <w:rFonts w:ascii="Consolas" w:hAnsi="Consolas"/>
+          <w:sz w:val="19"/>
+        </w:rPr>
+        <w:t>UnitPrice</w:t>
+      </w:r>
+      <w:r>
+        <w:t xml:space="preserve"> for fee checks. Ignore </w:t>
+      </w:r>
+      <w:r>
+        <w:rPr>
+          <w:rFonts w:ascii="Consolas" w:hAnsi="Consolas"/>
+          <w:sz w:val="19"/>
+        </w:rPr>
+        <w:t>Calculated_Rate__c</w:t>
+      </w:r>
+      <w:r>
+        <w:t>.</w:t>
+      </w:r>
+    </w:p>
+    <w:p>
+      <w:pPr>
+        <w:pStyle w:val="ListBullet"/>
+      </w:pPr>
+      <w:r>
+        <w:rPr>
+          <w:b/>
+        </w:rPr>
+        <w:t>`Platform_Fee__c` / `Minimum_Spend__c` / `Number_Of_Months__c`</w:t>
+      </w:r>
+      <w:r>
+        <w:t xml:space="preserve"> do not exist</w:t>
+      </w:r>
+    </w:p>
+    <w:p>
+      <w:r>
+        <w:t xml:space="preserve">  on the Opportunity — </w:t>
+      </w:r>
+      <w:r>
+        <w:rPr>
+          <w:rFonts w:ascii="Consolas" w:hAnsi="Consolas"/>
+          <w:sz w:val="19"/>
+        </w:rPr>
+        <w:t>Platform_Fee__c</w:t>
+      </w:r>
+      <w:r>
+        <w:t xml:space="preserve"> and </w:t>
+      </w:r>
+      <w:r>
+        <w:rPr>
+          <w:rFonts w:ascii="Consolas" w:hAnsi="Consolas"/>
+          <w:sz w:val="19"/>
+        </w:rPr>
+        <w:t>Number_Of_Months__c</w:t>
+      </w:r>
+      <w:r>
+        <w:t xml:space="preserve"> live on the</w:t>
+      </w:r>
+    </w:p>
+    <w:p>
+      <w:r>
+        <w:t xml:space="preserve">  </w:t>
+      </w:r>
+      <w:r>
+        <w:rPr>
+          <w:b/>
+        </w:rPr>
+        <w:t>line item</w:t>
+      </w:r>
+      <w:r>
+        <w:t xml:space="preserve">; </w:t>
+      </w:r>
+      <w:r>
+        <w:rPr>
+          <w:rFonts w:ascii="Consolas" w:hAnsi="Consolas"/>
+          <w:sz w:val="19"/>
+        </w:rPr>
+        <w:t>Minimum_Spend__c</w:t>
+      </w:r>
+      <w:r>
+        <w:t xml:space="preserve"> lives on the </w:t>
+      </w:r>
+      <w:r>
+        <w:rPr>
+          <w:b/>
+        </w:rPr>
+        <w:t>Opportunity header</w:t>
+      </w:r>
+      <w:r>
+        <w:t>.</w:t>
+      </w:r>
+    </w:p>
+    <w:p>
+      <w:pPr>
+        <w:pStyle w:val="ListBullet"/>
+      </w:pPr>
+      <w:r>
+        <w:rPr>
+          <w:b/>
+        </w:rPr>
+        <w:t>Plus service window:</w:t>
+      </w:r>
+      <w:r>
+        <w:t xml:space="preserve"> derive from line-item </w:t>
+      </w:r>
+      <w:r>
+        <w:rPr>
+          <w:rFonts w:ascii="Consolas" w:hAnsi="Consolas"/>
+          <w:sz w:val="19"/>
+        </w:rPr>
+        <w:t>Number_Of_Months__c</w:t>
+      </w:r>
+      <w:r>
+        <w:t xml:space="preserve"> (start =</w:t>
+      </w:r>
+    </w:p>
+    <w:p>
+      <w:r>
+        <w:t xml:space="preserve">  SO start date, end = start + N months − 1 day). Do </w:t>
+      </w:r>
+      <w:r>
+        <w:rPr>
+          <w:b/>
+        </w:rPr>
+        <w:t>not</w:t>
+      </w:r>
+      <w:r>
+        <w:t xml:space="preserve"> compare line-item</w:t>
+      </w:r>
+    </w:p>
+    <w:p>
+      <w:r>
+        <w:t xml:space="preserve">  </w:t>
+      </w:r>
+      <w:r>
+        <w:rPr>
+          <w:rFonts w:ascii="Consolas" w:hAnsi="Consolas"/>
+          <w:sz w:val="19"/>
+        </w:rPr>
+        <w:t>Start_Date__c</w:t>
+      </w:r>
+      <w:r>
+        <w:t>/</w:t>
+      </w:r>
+      <w:r>
+        <w:rPr>
+          <w:rFonts w:ascii="Consolas" w:hAnsi="Consolas"/>
+          <w:sz w:val="19"/>
+        </w:rPr>
+        <w:t>End_Date__c</w:t>
+      </w:r>
+      <w:r>
+        <w:t xml:space="preserve"> — they auto-stamp from the close date.</w:t>
+      </w:r>
+    </w:p>
+    <w:p>
+      <w:pPr>
+        <w:pStyle w:val="Heading3"/>
+      </w:pPr>
+      <w:r>
+        <w:t>SpotDraft</w:t>
+      </w:r>
+    </w:p>
+    <w:p>
+      <w:pPr>
+        <w:pStyle w:val="ListBullet"/>
+      </w:pPr>
+      <w:r>
+        <w:rPr>
+          <w:rFonts w:ascii="Consolas" w:hAnsi="Consolas"/>
+          <w:sz w:val="19"/>
+        </w:rPr>
+        <w:t>key_pointers</w:t>
+      </w:r>
+      <w:r>
+        <w:t xml:space="preserve"> returns a </w:t>
+      </w:r>
+      <w:r>
+        <w:rPr>
+          <w:b/>
+        </w:rPr>
+        <w:t>list</w:t>
+      </w:r>
+      <w:r>
+        <w:t xml:space="preserve"> of field objects (</w:t>
+      </w:r>
+      <w:r>
+        <w:rPr>
+          <w:rFonts w:ascii="Consolas" w:hAnsi="Consolas"/>
+          <w:sz w:val="19"/>
+        </w:rPr>
+        <w:t>label</w:t>
+      </w:r>
+      <w:r>
+        <w:t xml:space="preserve">, </w:t>
+      </w:r>
+      <w:r>
+        <w:rPr>
+          <w:rFonts w:ascii="Consolas" w:hAnsi="Consolas"/>
+          <w:sz w:val="19"/>
+        </w:rPr>
+        <w:t>value</w:t>
+      </w:r>
+      <w:r>
+        <w:t>, …) — good</w:t>
+      </w:r>
+    </w:p>
+    <w:p>
+      <w:r>
+        <w:t xml:space="preserve">  for Package, Shop name, fee values.</w:t>
+      </w:r>
+    </w:p>
+    <w:p>
+      <w:pPr>
+        <w:pStyle w:val="ListBullet"/>
+      </w:pPr>
+      <w:r>
+        <w:rPr>
+          <w:b/>
+        </w:rPr>
+        <w:t>`ContractStartDate` in `key_pointers` is unreliable</w:t>
+      </w:r>
+      <w:r>
+        <w:t xml:space="preserve"> (observed ~1 month early,</w:t>
+      </w:r>
+    </w:p>
+    <w:p>
+      <w:r>
+        <w:t xml:space="preserve">  e.g. Tubby Todd, Dossier). </w:t>
+      </w:r>
+      <w:r>
+        <w:rPr>
+          <w:b/>
+        </w:rPr>
+        <w:t>Always read Term Start/End from the PDF text</w:t>
+      </w:r>
+      <w:r>
+        <w:t>, not</w:t>
+      </w:r>
+    </w:p>
+    <w:p>
+      <w:r>
+        <w:t xml:space="preserve">  from </w:t>
+      </w:r>
+      <w:r>
+        <w:rPr>
+          <w:rFonts w:ascii="Consolas" w:hAnsi="Consolas"/>
+          <w:sz w:val="19"/>
+        </w:rPr>
+        <w:t>key_pointers</w:t>
+      </w:r>
+      <w:r>
+        <w:t>.</w:t>
+      </w:r>
+    </w:p>
+    <w:p>
+      <w:pPr>
+        <w:pStyle w:val="ListBullet"/>
+      </w:pPr>
+      <w:r>
+        <w:rPr>
+          <w:rFonts w:ascii="Consolas" w:hAnsi="Consolas"/>
+          <w:sz w:val="19"/>
+        </w:rPr>
+        <w:t>SpotDraft_Contract__c.Opportunity__c</w:t>
+      </w:r>
+      <w:r>
+        <w:t xml:space="preserve"> is populated </w:t>
+      </w:r>
+      <w:r>
+        <w:rPr>
+          <w:b/>
+        </w:rPr>
+        <w:t>0 / 630</w:t>
+      </w:r>
+      <w:r>
+        <w:t xml:space="preserve"> in 2026 — there is</w:t>
+      </w:r>
+    </w:p>
+    <w:p>
+      <w:r>
+        <w:t xml:space="preserve">  </w:t>
+      </w:r>
+      <w:r>
+        <w:rPr>
+          <w:b/>
+        </w:rPr>
+        <w:t>no deterministic opp→contract link</w:t>
+      </w:r>
+      <w:r>
+        <w:t xml:space="preserve"> in SFDC today (see §7 contract selection).</w:t>
       </w:r>
     </w:p>
     <w:p>
@@ -715,22 +1251,202 @@
         <w:pStyle w:val="Heading2"/>
       </w:pPr>
       <w:r>
-        <w:t>Salesforce — Opportunity (header)</w:t>
+        <w:t>4. Contract selection logic</w:t>
       </w:r>
     </w:p>
     <w:p>
       <w:r>
-        <w:t>`Id, Name, Type, StageName, CloseDate, AccountId, Account.Name, Owner.Name,</w:t>
+        <w:t>There is no reliable foreign key from Opportunity to SpotDraft contract, so we</w:t>
       </w:r>
     </w:p>
     <w:p>
       <w:r>
-        <w:t>Shop_ID__c, Start_Date__c, DocuSign_End_Date__c, Opt_Out__c, Opt_Out_Date__c,</w:t>
+        <w:t>select by heuristic and state our confidence:</w:t>
       </w:r>
     </w:p>
     <w:p>
-      <w:r>
-        <w:t>Minimum_Spend__c`</w:t>
+      <w:pPr>
+        <w:pStyle w:val="ListNumber"/>
+      </w:pPr>
+      <w:r>
+        <w:t xml:space="preserve">Prefer the </w:t>
+      </w:r>
+      <w:r>
+        <w:rPr>
+          <w:b/>
+        </w:rPr>
+        <w:t>executed Proposed Service Order</w:t>
+      </w:r>
+      <w:r>
+        <w:t xml:space="preserve"> for the account, **created</w:t>
+      </w:r>
+    </w:p>
+    <w:p>
+      <w:r>
+        <w:t xml:space="preserve">   nearest** (usually shortly before) the opp CloseDate, typically by the opp owner,</w:t>
+      </w:r>
+    </w:p>
+    <w:p>
+      <w:r>
+        <w:t xml:space="preserve">   and belonging to </w:t>
+      </w:r>
+      <w:r>
+        <w:rPr>
+          <w:b/>
+        </w:rPr>
+        <w:t>this</w:t>
+      </w:r>
+      <w:r>
+        <w:t xml:space="preserve"> deal.</w:t>
+      </w:r>
+    </w:p>
+    <w:p>
+      <w:pPr>
+        <w:pStyle w:val="ListNumber"/>
+      </w:pPr>
+      <w:r>
+        <w:t xml:space="preserve">If the deal's own SO exists but is still </w:t>
+      </w:r>
+      <w:r>
+        <w:rPr>
+          <w:b/>
+        </w:rPr>
+        <w:t>in signature stage</w:t>
+      </w:r>
+      <w:r>
+        <w:t xml:space="preserve"> (SpotDraft status</w:t>
+      </w:r>
+    </w:p>
+    <w:p>
+      <w:r>
+        <w:t xml:space="preserve">   </w:t>
+      </w:r>
+      <w:r>
+        <w:rPr>
+          <w:rFonts w:ascii="Consolas" w:hAnsi="Consolas"/>
+          <w:sz w:val="19"/>
+        </w:rPr>
+        <w:t>SIGN</w:t>
+      </w:r>
+      <w:r>
+        <w:t xml:space="preserve"> — sent, not yet executed), audit that and mark the result</w:t>
+      </w:r>
+    </w:p>
+    <w:p>
+      <w:r>
+        <w:t xml:space="preserve">   </w:t>
+      </w:r>
+      <w:r>
+        <w:rPr>
+          <w:b/>
+        </w:rPr>
+        <w:t>`⚠ PRELIMINARY`</w:t>
+      </w:r>
+      <w:r>
+        <w:t>.</w:t>
+      </w:r>
+    </w:p>
+    <w:p>
+      <w:pPr>
+        <w:pStyle w:val="ListNumber"/>
+      </w:pPr>
+      <w:r>
+        <w:rPr>
+          <w:b/>
+        </w:rPr>
+        <w:t>Do NOT fall back to a prior-term executed SO</w:t>
+      </w:r>
+      <w:r>
+        <w:t xml:space="preserve"> when the current deal has its own</w:t>
+      </w:r>
+    </w:p>
+    <w:p>
+      <w:r>
+        <w:t xml:space="preserve">   SO (whether </w:t>
+      </w:r>
+      <w:r>
+        <w:rPr>
+          <w:rFonts w:ascii="Consolas" w:hAnsi="Consolas"/>
+          <w:sz w:val="19"/>
+        </w:rPr>
+        <w:t>SIGN</w:t>
+      </w:r>
+      <w:r>
+        <w:t xml:space="preserve"> or executed). A renewal/amendment with only a </w:t>
+      </w:r>
+      <w:r>
+        <w:rPr>
+          <w:rFonts w:ascii="Consolas" w:hAnsi="Consolas"/>
+          <w:sz w:val="19"/>
+        </w:rPr>
+        <w:t>SIGN</w:t>
+      </w:r>
+      <w:r>
+        <w:t xml:space="preserve"> contract</w:t>
+      </w:r>
+    </w:p>
+    <w:p>
+      <w:r>
+        <w:t xml:space="preserve">   audits as PRELIMINARY; a deal with only a draft (no published version) is **not</w:t>
+      </w:r>
+    </w:p>
+    <w:p>
+      <w:r>
+        <w:t xml:space="preserve">   auditable** and is reported as such.</w:t>
+      </w:r>
+    </w:p>
+    <w:p>
+      <w:r>
+        <w:rPr>
+          <w:b/>
+        </w:rPr>
+        <w:t>Gate checks (report and stop if either fails):</w:t>
+      </w:r>
+    </w:p>
+    <w:p>
+      <w:pPr>
+        <w:pStyle w:val="ListBullet"/>
+      </w:pPr>
+      <w:r>
+        <w:t xml:space="preserve">Opportunity </w:t>
+      </w:r>
+      <w:r>
+        <w:rPr>
+          <w:rFonts w:ascii="Consolas" w:hAnsi="Consolas"/>
+          <w:sz w:val="19"/>
+        </w:rPr>
+        <w:t>StageName</w:t>
+      </w:r>
+      <w:r>
+        <w:t xml:space="preserve"> = "Closed Won" (post-close channel) — pre-close channel</w:t>
+      </w:r>
+    </w:p>
+    <w:p>
+      <w:r>
+        <w:t xml:space="preserve">  audits Stage 5 opps as PRELIMINARY by design.</w:t>
+      </w:r>
+    </w:p>
+    <w:p>
+      <w:pPr>
+        <w:pStyle w:val="ListBullet"/>
+      </w:pPr>
+      <w:r>
+        <w:t xml:space="preserve">Contract status = Executed or </w:t>
+      </w:r>
+      <w:r>
+        <w:rPr>
+          <w:rFonts w:ascii="Consolas" w:hAnsi="Consolas"/>
+          <w:sz w:val="19"/>
+        </w:rPr>
+        <w:t>SIGN</w:t>
+      </w:r>
+      <w:r>
+        <w:t>. Earlier stages (draft/negotiation, no</w:t>
+      </w:r>
+    </w:p>
+    <w:p>
+      <w:r>
+        <w:t xml:space="preserve">  published version, extraction not completed) fail the gate.</w:t>
       </w:r>
     </w:p>
     <w:p>
@@ -738,654 +1454,6 @@
         <w:pStyle w:val="Heading2"/>
       </w:pPr>
       <w:r>
-        <w:t>Salesforce — OpportunityLineItem</w:t>
-      </w:r>
-    </w:p>
-    <w:p>
-      <w:r>
-        <w:rPr>
-          <w:rFonts w:ascii="Consolas" w:hAnsi="Consolas"/>
-          <w:sz w:val="19"/>
-        </w:rPr>
-        <w:t>Product2.Name, Package_Type__c, Platform_Fee__c, Number_Of_Months__c, UnitPrice</w:t>
-      </w:r>
-    </w:p>
-    <w:p>
-      <w:pPr>
-        <w:pStyle w:val="Heading2"/>
-      </w:pPr>
-      <w:r>
-        <w:t>Field gotchas (trust these over labels — learned from the live org)</w:t>
-      </w:r>
-    </w:p>
-    <w:p>
-      <w:pPr>
-        <w:pStyle w:val="ListBullet"/>
-      </w:pPr>
-      <w:r>
-        <w:rPr>
-          <w:b/>
-        </w:rPr>
-        <w:t>Dates:</w:t>
-      </w:r>
-      <w:r>
-        <w:t xml:space="preserve"> use </w:t>
-      </w:r>
-      <w:r>
-        <w:rPr>
-          <w:rFonts w:ascii="Consolas" w:hAnsi="Consolas"/>
-          <w:sz w:val="19"/>
-        </w:rPr>
-        <w:t>Start_Date__c</w:t>
-      </w:r>
-      <w:r>
-        <w:t xml:space="preserve"> (label "Contract Start Date") and</w:t>
-      </w:r>
-    </w:p>
-    <w:p>
-      <w:r>
-        <w:t xml:space="preserve">  </w:t>
-      </w:r>
-      <w:r>
-        <w:rPr>
-          <w:rFonts w:ascii="Consolas" w:hAnsi="Consolas"/>
-          <w:sz w:val="19"/>
-        </w:rPr>
-        <w:t>DocuSign_End_Date__c</w:t>
-      </w:r>
-      <w:r>
-        <w:t xml:space="preserve"> (label "Contract End Date"). The fields</w:t>
-      </w:r>
-    </w:p>
-    <w:p>
-      <w:r>
-        <w:t xml:space="preserve">  </w:t>
-      </w:r>
-      <w:r>
-        <w:rPr>
-          <w:rFonts w:ascii="Consolas" w:hAnsi="Consolas"/>
-          <w:sz w:val="19"/>
-        </w:rPr>
-        <w:t>Contract_Start_Date__c</w:t>
-      </w:r>
-      <w:r>
-        <w:t xml:space="preserve"> / </w:t>
-      </w:r>
-      <w:r>
-        <w:rPr>
-          <w:rFonts w:ascii="Consolas" w:hAnsi="Consolas"/>
-          <w:sz w:val="19"/>
-        </w:rPr>
-        <w:t>Contract_End_Date__c</w:t>
-      </w:r>
-      <w:r>
-        <w:t xml:space="preserve"> are </w:t>
-      </w:r>
-      <w:r>
-        <w:rPr>
-          <w:b/>
-        </w:rPr>
-        <w:t>deprecated</w:t>
-      </w:r>
-      <w:r>
-        <w:t xml:space="preserve"> — never use.</w:t>
-      </w:r>
-    </w:p>
-    <w:p>
-      <w:pPr>
-        <w:pStyle w:val="ListBullet"/>
-      </w:pPr>
-      <w:r>
-        <w:rPr>
-          <w:b/>
-        </w:rPr>
-        <w:t>Line-item "Monthly Fee"</w:t>
-      </w:r>
-      <w:r>
-        <w:t xml:space="preserve"> is API name </w:t>
-      </w:r>
-      <w:r>
-        <w:rPr>
-          <w:rFonts w:ascii="Consolas" w:hAnsi="Consolas"/>
-          <w:sz w:val="19"/>
-        </w:rPr>
-        <w:t>Platform_Fee__c</w:t>
-      </w:r>
-      <w:r>
-        <w:t xml:space="preserve"> (label/API mismatch).</w:t>
-      </w:r>
-    </w:p>
-    <w:p>
-      <w:r>
-        <w:t xml:space="preserve">  Do </w:t>
-      </w:r>
-      <w:r>
-        <w:rPr>
-          <w:b/>
-        </w:rPr>
-        <w:t>not</w:t>
-      </w:r>
-      <w:r>
-        <w:t xml:space="preserve"> use </w:t>
-      </w:r>
-      <w:r>
-        <w:rPr>
-          <w:rFonts w:ascii="Consolas" w:hAnsi="Consolas"/>
-          <w:sz w:val="19"/>
-        </w:rPr>
-        <w:t>UnitPrice</w:t>
-      </w:r>
-      <w:r>
-        <w:t xml:space="preserve"> for fee checks. Ignore </w:t>
-      </w:r>
-      <w:r>
-        <w:rPr>
-          <w:rFonts w:ascii="Consolas" w:hAnsi="Consolas"/>
-          <w:sz w:val="19"/>
-        </w:rPr>
-        <w:t>Calculated_Rate__c</w:t>
-      </w:r>
-      <w:r>
-        <w:t>.</w:t>
-      </w:r>
-    </w:p>
-    <w:p>
-      <w:pPr>
-        <w:pStyle w:val="ListBullet"/>
-      </w:pPr>
-      <w:r>
-        <w:rPr>
-          <w:b/>
-        </w:rPr>
-        <w:t>`Platform_Fee__c` / `Minimum_Spend__c` / `Number_Of_Months__c`</w:t>
-      </w:r>
-      <w:r>
-        <w:t xml:space="preserve"> do not exist</w:t>
-      </w:r>
-    </w:p>
-    <w:p>
-      <w:r>
-        <w:t xml:space="preserve">  on the Opportunity — </w:t>
-      </w:r>
-      <w:r>
-        <w:rPr>
-          <w:rFonts w:ascii="Consolas" w:hAnsi="Consolas"/>
-          <w:sz w:val="19"/>
-        </w:rPr>
-        <w:t>Platform_Fee__c</w:t>
-      </w:r>
-      <w:r>
-        <w:t xml:space="preserve"> and </w:t>
-      </w:r>
-      <w:r>
-        <w:rPr>
-          <w:rFonts w:ascii="Consolas" w:hAnsi="Consolas"/>
-          <w:sz w:val="19"/>
-        </w:rPr>
-        <w:t>Number_Of_Months__c</w:t>
-      </w:r>
-      <w:r>
-        <w:t xml:space="preserve"> live on the</w:t>
-      </w:r>
-    </w:p>
-    <w:p>
-      <w:r>
-        <w:t xml:space="preserve">  </w:t>
-      </w:r>
-      <w:r>
-        <w:rPr>
-          <w:b/>
-        </w:rPr>
-        <w:t>line item</w:t>
-      </w:r>
-      <w:r>
-        <w:t xml:space="preserve">; </w:t>
-      </w:r>
-      <w:r>
-        <w:rPr>
-          <w:rFonts w:ascii="Consolas" w:hAnsi="Consolas"/>
-          <w:sz w:val="19"/>
-        </w:rPr>
-        <w:t>Minimum_Spend__c</w:t>
-      </w:r>
-      <w:r>
-        <w:t xml:space="preserve"> lives on the </w:t>
-      </w:r>
-      <w:r>
-        <w:rPr>
-          <w:b/>
-        </w:rPr>
-        <w:t>Opportunity header</w:t>
-      </w:r>
-      <w:r>
-        <w:t>.</w:t>
-      </w:r>
-    </w:p>
-    <w:p>
-      <w:pPr>
-        <w:pStyle w:val="ListBullet"/>
-      </w:pPr>
-      <w:r>
-        <w:rPr>
-          <w:b/>
-        </w:rPr>
-        <w:t>Plus service window:</w:t>
-      </w:r>
-      <w:r>
-        <w:t xml:space="preserve"> derive from line-item </w:t>
-      </w:r>
-      <w:r>
-        <w:rPr>
-          <w:rFonts w:ascii="Consolas" w:hAnsi="Consolas"/>
-          <w:sz w:val="19"/>
-        </w:rPr>
-        <w:t>Number_Of_Months__c</w:t>
-      </w:r>
-      <w:r>
-        <w:t xml:space="preserve"> (start =</w:t>
-      </w:r>
-    </w:p>
-    <w:p>
-      <w:r>
-        <w:t xml:space="preserve">  SO start date, end = start + N months − 1 day). Do </w:t>
-      </w:r>
-      <w:r>
-        <w:rPr>
-          <w:b/>
-        </w:rPr>
-        <w:t>not</w:t>
-      </w:r>
-      <w:r>
-        <w:t xml:space="preserve"> compare line-item</w:t>
-      </w:r>
-    </w:p>
-    <w:p>
-      <w:r>
-        <w:t xml:space="preserve">  </w:t>
-      </w:r>
-      <w:r>
-        <w:rPr>
-          <w:rFonts w:ascii="Consolas" w:hAnsi="Consolas"/>
-          <w:sz w:val="19"/>
-        </w:rPr>
-        <w:t>Start_Date__c</w:t>
-      </w:r>
-      <w:r>
-        <w:t>/</w:t>
-      </w:r>
-      <w:r>
-        <w:rPr>
-          <w:rFonts w:ascii="Consolas" w:hAnsi="Consolas"/>
-          <w:sz w:val="19"/>
-        </w:rPr>
-        <w:t>End_Date__c</w:t>
-      </w:r>
-      <w:r>
-        <w:t xml:space="preserve"> — they auto-stamp from the close date.</w:t>
-      </w:r>
-    </w:p>
-    <w:p>
-      <w:pPr>
-        <w:pStyle w:val="Heading2"/>
-      </w:pPr>
-      <w:r>
-        <w:t>SpotDraft</w:t>
-      </w:r>
-    </w:p>
-    <w:p>
-      <w:pPr>
-        <w:pStyle w:val="ListBullet"/>
-      </w:pPr>
-      <w:r>
-        <w:rPr>
-          <w:rFonts w:ascii="Consolas" w:hAnsi="Consolas"/>
-          <w:sz w:val="19"/>
-        </w:rPr>
-        <w:t>key_pointers</w:t>
-      </w:r>
-      <w:r>
-        <w:t xml:space="preserve"> returns a </w:t>
-      </w:r>
-      <w:r>
-        <w:rPr>
-          <w:b/>
-        </w:rPr>
-        <w:t>list</w:t>
-      </w:r>
-      <w:r>
-        <w:t xml:space="preserve"> of field objects (</w:t>
-      </w:r>
-      <w:r>
-        <w:rPr>
-          <w:rFonts w:ascii="Consolas" w:hAnsi="Consolas"/>
-          <w:sz w:val="19"/>
-        </w:rPr>
-        <w:t>label</w:t>
-      </w:r>
-      <w:r>
-        <w:t xml:space="preserve">, </w:t>
-      </w:r>
-      <w:r>
-        <w:rPr>
-          <w:rFonts w:ascii="Consolas" w:hAnsi="Consolas"/>
-          <w:sz w:val="19"/>
-        </w:rPr>
-        <w:t>value</w:t>
-      </w:r>
-      <w:r>
-        <w:t>, …) — good</w:t>
-      </w:r>
-    </w:p>
-    <w:p>
-      <w:r>
-        <w:t xml:space="preserve">  for Package, Shop name, fee values.</w:t>
-      </w:r>
-    </w:p>
-    <w:p>
-      <w:pPr>
-        <w:pStyle w:val="ListBullet"/>
-      </w:pPr>
-      <w:r>
-        <w:rPr>
-          <w:b/>
-        </w:rPr>
-        <w:t>`ContractStartDate` in `key_pointers` is unreliable</w:t>
-      </w:r>
-      <w:r>
-        <w:t xml:space="preserve"> (observed ~1 month early,</w:t>
-      </w:r>
-    </w:p>
-    <w:p>
-      <w:r>
-        <w:t xml:space="preserve">  e.g. Tubby Todd, Dossier). </w:t>
-      </w:r>
-      <w:r>
-        <w:rPr>
-          <w:b/>
-        </w:rPr>
-        <w:t>Always read Term Start/End from the PDF text</w:t>
-      </w:r>
-      <w:r>
-        <w:t>, not</w:t>
-      </w:r>
-    </w:p>
-    <w:p>
-      <w:r>
-        <w:t xml:space="preserve">  from </w:t>
-      </w:r>
-      <w:r>
-        <w:rPr>
-          <w:rFonts w:ascii="Consolas" w:hAnsi="Consolas"/>
-          <w:sz w:val="19"/>
-        </w:rPr>
-        <w:t>key_pointers</w:t>
-      </w:r>
-      <w:r>
-        <w:t>.</w:t>
-      </w:r>
-    </w:p>
-    <w:p>
-      <w:pPr>
-        <w:pStyle w:val="ListBullet"/>
-      </w:pPr>
-      <w:r>
-        <w:rPr>
-          <w:rFonts w:ascii="Consolas" w:hAnsi="Consolas"/>
-          <w:sz w:val="19"/>
-        </w:rPr>
-        <w:t>SpotDraft_Contract__c.Opportunity__c</w:t>
-      </w:r>
-      <w:r>
-        <w:t xml:space="preserve"> is populated </w:t>
-      </w:r>
-      <w:r>
-        <w:rPr>
-          <w:b/>
-        </w:rPr>
-        <w:t>0 / 630</w:t>
-      </w:r>
-      <w:r>
-        <w:t xml:space="preserve"> in 2026 — there is</w:t>
-      </w:r>
-    </w:p>
-    <w:p>
-      <w:r>
-        <w:t xml:space="preserve">  </w:t>
-      </w:r>
-      <w:r>
-        <w:rPr>
-          <w:b/>
-        </w:rPr>
-        <w:t>no deterministic opp→contract link</w:t>
-      </w:r>
-      <w:r>
-        <w:t xml:space="preserve"> in SFDC today (see §7 contract selection).</w:t>
-      </w:r>
-    </w:p>
-    <w:p>
-      <w:r>
-        <w:rPr>
-          <w:color w:val="BBBBBB"/>
-        </w:rPr>
-        <w:t>________________________________________</w:t>
-      </w:r>
-    </w:p>
-    <w:p>
-      <w:pPr>
-        <w:pStyle w:val="Heading1"/>
-      </w:pPr>
-      <w:r>
-        <w:t>4. Contract selection logic</w:t>
-      </w:r>
-    </w:p>
-    <w:p>
-      <w:r>
-        <w:t>There is no reliable foreign key from Opportunity to SpotDraft contract, so we</w:t>
-      </w:r>
-    </w:p>
-    <w:p>
-      <w:r>
-        <w:t>select by heuristic and state our confidence:</w:t>
-      </w:r>
-    </w:p>
-    <w:p>
-      <w:pPr>
-        <w:pStyle w:val="ListNumber"/>
-      </w:pPr>
-      <w:r>
-        <w:t xml:space="preserve">Prefer the </w:t>
-      </w:r>
-      <w:r>
-        <w:rPr>
-          <w:b/>
-        </w:rPr>
-        <w:t>executed Proposed Service Order</w:t>
-      </w:r>
-      <w:r>
-        <w:t xml:space="preserve"> for the account, **created</w:t>
-      </w:r>
-    </w:p>
-    <w:p>
-      <w:r>
-        <w:t xml:space="preserve">   nearest** (usually shortly before) the opp CloseDate, typically by the opp owner,</w:t>
-      </w:r>
-    </w:p>
-    <w:p>
-      <w:r>
-        <w:t xml:space="preserve">   and belonging to </w:t>
-      </w:r>
-      <w:r>
-        <w:rPr>
-          <w:b/>
-        </w:rPr>
-        <w:t>this</w:t>
-      </w:r>
-      <w:r>
-        <w:t xml:space="preserve"> deal.</w:t>
-      </w:r>
-    </w:p>
-    <w:p>
-      <w:pPr>
-        <w:pStyle w:val="ListNumber"/>
-      </w:pPr>
-      <w:r>
-        <w:t xml:space="preserve">If the deal's own SO exists but is still </w:t>
-      </w:r>
-      <w:r>
-        <w:rPr>
-          <w:b/>
-        </w:rPr>
-        <w:t>in signature stage</w:t>
-      </w:r>
-      <w:r>
-        <w:t xml:space="preserve"> (SpotDraft status</w:t>
-      </w:r>
-    </w:p>
-    <w:p>
-      <w:r>
-        <w:t xml:space="preserve">   </w:t>
-      </w:r>
-      <w:r>
-        <w:rPr>
-          <w:rFonts w:ascii="Consolas" w:hAnsi="Consolas"/>
-          <w:sz w:val="19"/>
-        </w:rPr>
-        <w:t>SIGN</w:t>
-      </w:r>
-      <w:r>
-        <w:t xml:space="preserve"> — sent, not yet executed), audit that and mark the result</w:t>
-      </w:r>
-    </w:p>
-    <w:p>
-      <w:r>
-        <w:t xml:space="preserve">   </w:t>
-      </w:r>
-      <w:r>
-        <w:rPr>
-          <w:b/>
-        </w:rPr>
-        <w:t>`⚠ PRELIMINARY`</w:t>
-      </w:r>
-      <w:r>
-        <w:t>.</w:t>
-      </w:r>
-    </w:p>
-    <w:p>
-      <w:pPr>
-        <w:pStyle w:val="ListNumber"/>
-      </w:pPr>
-      <w:r>
-        <w:rPr>
-          <w:b/>
-        </w:rPr>
-        <w:t>Do NOT fall back to a prior-term executed SO</w:t>
-      </w:r>
-      <w:r>
-        <w:t xml:space="preserve"> when the current deal has its own</w:t>
-      </w:r>
-    </w:p>
-    <w:p>
-      <w:r>
-        <w:t xml:space="preserve">   SO (whether </w:t>
-      </w:r>
-      <w:r>
-        <w:rPr>
-          <w:rFonts w:ascii="Consolas" w:hAnsi="Consolas"/>
-          <w:sz w:val="19"/>
-        </w:rPr>
-        <w:t>SIGN</w:t>
-      </w:r>
-      <w:r>
-        <w:t xml:space="preserve"> or executed). A renewal/amendment with only a </w:t>
-      </w:r>
-      <w:r>
-        <w:rPr>
-          <w:rFonts w:ascii="Consolas" w:hAnsi="Consolas"/>
-          <w:sz w:val="19"/>
-        </w:rPr>
-        <w:t>SIGN</w:t>
-      </w:r>
-      <w:r>
-        <w:t xml:space="preserve"> contract</w:t>
-      </w:r>
-    </w:p>
-    <w:p>
-      <w:r>
-        <w:t xml:space="preserve">   audits as PRELIMINARY; a deal with only a draft (no published version) is **not</w:t>
-      </w:r>
-    </w:p>
-    <w:p>
-      <w:r>
-        <w:t xml:space="preserve">   auditable** and is reported as such.</w:t>
-      </w:r>
-    </w:p>
-    <w:p>
-      <w:r>
-        <w:rPr>
-          <w:b/>
-        </w:rPr>
-        <w:t>Gate checks (report and stop if either fails):</w:t>
-      </w:r>
-    </w:p>
-    <w:p>
-      <w:pPr>
-        <w:pStyle w:val="ListBullet"/>
-      </w:pPr>
-      <w:r>
-        <w:t xml:space="preserve">Opportunity </w:t>
-      </w:r>
-      <w:r>
-        <w:rPr>
-          <w:rFonts w:ascii="Consolas" w:hAnsi="Consolas"/>
-          <w:sz w:val="19"/>
-        </w:rPr>
-        <w:t>StageName</w:t>
-      </w:r>
-      <w:r>
-        <w:t xml:space="preserve"> = "Closed Won" (post-close channel) — pre-close channel</w:t>
-      </w:r>
-    </w:p>
-    <w:p>
-      <w:r>
-        <w:t xml:space="preserve">  audits Stage 5 opps as PRELIMINARY by design.</w:t>
-      </w:r>
-    </w:p>
-    <w:p>
-      <w:pPr>
-        <w:pStyle w:val="ListBullet"/>
-      </w:pPr>
-      <w:r>
-        <w:t xml:space="preserve">Contract status = Executed or </w:t>
-      </w:r>
-      <w:r>
-        <w:rPr>
-          <w:rFonts w:ascii="Consolas" w:hAnsi="Consolas"/>
-          <w:sz w:val="19"/>
-        </w:rPr>
-        <w:t>SIGN</w:t>
-      </w:r>
-      <w:r>
-        <w:t>. Earlier stages (draft/negotiation, no</w:t>
-      </w:r>
-    </w:p>
-    <w:p>
-      <w:r>
-        <w:t xml:space="preserve">  published version, extraction not completed) fail the gate.</w:t>
-      </w:r>
-    </w:p>
-    <w:p>
-      <w:r>
-        <w:rPr>
-          <w:color w:val="BBBBBB"/>
-        </w:rPr>
-        <w:t>________________________________________</w:t>
-      </w:r>
-    </w:p>
-    <w:p>
-      <w:pPr>
-        <w:pStyle w:val="Heading1"/>
-      </w:pPr>
-      <w:r>
         <w:t>5. The 16-check audit</w:t>
       </w:r>
     </w:p>
@@ -1407,7 +1475,7 @@
     </w:p>
     <w:tbl>
       <w:tblPr>
-        <w:tblStyle w:val="LightGrid-Accent1"/>
+        <w:tblStyle w:val="TableGrid"/>
         <w:tblW w:type="auto" w:w="0"/>
         <w:tblLook w:firstColumn="1" w:firstRow="1" w:lastColumn="0" w:lastRow="0" w:noHBand="0" w:noVBand="1" w:val="04A0"/>
       </w:tblPr>
@@ -1422,6 +1490,12 @@
         <w:tc>
           <w:tcPr>
             <w:tcW w:type="dxa" w:w="1728"/>
+            <w:tcBorders>
+              <w:top w:val="single" w:sz="4" w:color="999999"/>
+              <w:left w:val="single" w:sz="4" w:color="999999"/>
+              <w:bottom w:val="single" w:sz="4" w:color="999999"/>
+              <w:right w:val="single" w:sz="4" w:color="999999"/>
+            </w:tcBorders>
           </w:tcPr>
           <w:p>
             <w:r>
@@ -1440,6 +1514,12 @@
         <w:tc>
           <w:tcPr>
             <w:tcW w:type="dxa" w:w="1728"/>
+            <w:tcBorders>
+              <w:top w:val="single" w:sz="4" w:color="999999"/>
+              <w:left w:val="single" w:sz="4" w:color="999999"/>
+              <w:bottom w:val="single" w:sz="4" w:color="999999"/>
+              <w:right w:val="single" w:sz="4" w:color="999999"/>
+            </w:tcBorders>
           </w:tcPr>
           <w:p>
             <w:r>
@@ -1458,6 +1538,12 @@
         <w:tc>
           <w:tcPr>
             <w:tcW w:type="dxa" w:w="1728"/>
+            <w:tcBorders>
+              <w:top w:val="single" w:sz="4" w:color="999999"/>
+              <w:left w:val="single" w:sz="4" w:color="999999"/>
+              <w:bottom w:val="single" w:sz="4" w:color="999999"/>
+              <w:right w:val="single" w:sz="4" w:color="999999"/>
+            </w:tcBorders>
           </w:tcPr>
           <w:p>
             <w:r>
@@ -1476,6 +1562,12 @@
         <w:tc>
           <w:tcPr>
             <w:tcW w:type="dxa" w:w="1728"/>
+            <w:tcBorders>
+              <w:top w:val="single" w:sz="4" w:color="999999"/>
+              <w:left w:val="single" w:sz="4" w:color="999999"/>
+              <w:bottom w:val="single" w:sz="4" w:color="999999"/>
+              <w:right w:val="single" w:sz="4" w:color="999999"/>
+            </w:tcBorders>
           </w:tcPr>
           <w:p>
             <w:r>
@@ -1494,6 +1586,12 @@
         <w:tc>
           <w:tcPr>
             <w:tcW w:type="dxa" w:w="1728"/>
+            <w:tcBorders>
+              <w:top w:val="single" w:sz="4" w:color="999999"/>
+              <w:left w:val="single" w:sz="4" w:color="999999"/>
+              <w:bottom w:val="single" w:sz="4" w:color="999999"/>
+              <w:right w:val="single" w:sz="4" w:color="999999"/>
+            </w:tcBorders>
           </w:tcPr>
           <w:p>
             <w:r>
@@ -1514,6 +1612,12 @@
         <w:tc>
           <w:tcPr>
             <w:tcW w:type="dxa" w:w="1728"/>
+            <w:tcBorders>
+              <w:top w:val="single" w:sz="4" w:color="999999"/>
+              <w:left w:val="single" w:sz="4" w:color="999999"/>
+              <w:bottom w:val="single" w:sz="4" w:color="999999"/>
+              <w:right w:val="single" w:sz="4" w:color="999999"/>
+            </w:tcBorders>
           </w:tcPr>
           <w:p>
             <w:r/>
@@ -1525,6 +1629,12 @@
         <w:tc>
           <w:tcPr>
             <w:tcW w:type="dxa" w:w="1728"/>
+            <w:tcBorders>
+              <w:top w:val="single" w:sz="4" w:color="999999"/>
+              <w:left w:val="single" w:sz="4" w:color="999999"/>
+              <w:bottom w:val="single" w:sz="4" w:color="999999"/>
+              <w:right w:val="single" w:sz="4" w:color="999999"/>
+            </w:tcBorders>
           </w:tcPr>
           <w:p>
             <w:r/>
@@ -1536,6 +1646,12 @@
         <w:tc>
           <w:tcPr>
             <w:tcW w:type="dxa" w:w="1728"/>
+            <w:tcBorders>
+              <w:top w:val="single" w:sz="4" w:color="999999"/>
+              <w:left w:val="single" w:sz="4" w:color="999999"/>
+              <w:bottom w:val="single" w:sz="4" w:color="999999"/>
+              <w:right w:val="single" w:sz="4" w:color="999999"/>
+            </w:tcBorders>
           </w:tcPr>
           <w:p>
             <w:r/>
@@ -1547,6 +1663,12 @@
         <w:tc>
           <w:tcPr>
             <w:tcW w:type="dxa" w:w="1728"/>
+            <w:tcBorders>
+              <w:top w:val="single" w:sz="4" w:color="999999"/>
+              <w:left w:val="single" w:sz="4" w:color="999999"/>
+              <w:bottom w:val="single" w:sz="4" w:color="999999"/>
+              <w:right w:val="single" w:sz="4" w:color="999999"/>
+            </w:tcBorders>
           </w:tcPr>
           <w:p>
             <w:r/>
@@ -1562,6 +1684,12 @@
         <w:tc>
           <w:tcPr>
             <w:tcW w:type="dxa" w:w="1728"/>
+            <w:tcBorders>
+              <w:top w:val="single" w:sz="4" w:color="999999"/>
+              <w:left w:val="single" w:sz="4" w:color="999999"/>
+              <w:bottom w:val="single" w:sz="4" w:color="999999"/>
+              <w:right w:val="single" w:sz="4" w:color="999999"/>
+            </w:tcBorders>
           </w:tcPr>
           <w:p>
             <w:r/>
@@ -1584,6 +1712,12 @@
         <w:tc>
           <w:tcPr>
             <w:tcW w:type="dxa" w:w="1728"/>
+            <w:tcBorders>
+              <w:top w:val="single" w:sz="4" w:color="999999"/>
+              <w:left w:val="single" w:sz="4" w:color="999999"/>
+              <w:bottom w:val="single" w:sz="4" w:color="999999"/>
+              <w:right w:val="single" w:sz="4" w:color="999999"/>
+            </w:tcBorders>
           </w:tcPr>
           <w:p>
             <w:r/>
@@ -1595,6 +1729,12 @@
         <w:tc>
           <w:tcPr>
             <w:tcW w:type="dxa" w:w="1728"/>
+            <w:tcBorders>
+              <w:top w:val="single" w:sz="4" w:color="999999"/>
+              <w:left w:val="single" w:sz="4" w:color="999999"/>
+              <w:bottom w:val="single" w:sz="4" w:color="999999"/>
+              <w:right w:val="single" w:sz="4" w:color="999999"/>
+            </w:tcBorders>
           </w:tcPr>
           <w:p>
             <w:r/>
@@ -1606,6 +1746,12 @@
         <w:tc>
           <w:tcPr>
             <w:tcW w:type="dxa" w:w="1728"/>
+            <w:tcBorders>
+              <w:top w:val="single" w:sz="4" w:color="999999"/>
+              <w:left w:val="single" w:sz="4" w:color="999999"/>
+              <w:bottom w:val="single" w:sz="4" w:color="999999"/>
+              <w:right w:val="single" w:sz="4" w:color="999999"/>
+            </w:tcBorders>
           </w:tcPr>
           <w:p>
             <w:r/>
@@ -1617,6 +1763,12 @@
         <w:tc>
           <w:tcPr>
             <w:tcW w:type="dxa" w:w="1728"/>
+            <w:tcBorders>
+              <w:top w:val="single" w:sz="4" w:color="999999"/>
+              <w:left w:val="single" w:sz="4" w:color="999999"/>
+              <w:bottom w:val="single" w:sz="4" w:color="999999"/>
+              <w:right w:val="single" w:sz="4" w:color="999999"/>
+            </w:tcBorders>
           </w:tcPr>
           <w:p>
             <w:r/>
@@ -1632,6 +1784,12 @@
         <w:tc>
           <w:tcPr>
             <w:tcW w:type="dxa" w:w="1728"/>
+            <w:tcBorders>
+              <w:top w:val="single" w:sz="4" w:color="999999"/>
+              <w:left w:val="single" w:sz="4" w:color="999999"/>
+              <w:bottom w:val="single" w:sz="4" w:color="999999"/>
+              <w:right w:val="single" w:sz="4" w:color="999999"/>
+            </w:tcBorders>
           </w:tcPr>
           <w:p>
             <w:r/>
@@ -1645,6 +1803,12 @@
         <w:tc>
           <w:tcPr>
             <w:tcW w:type="dxa" w:w="1728"/>
+            <w:tcBorders>
+              <w:top w:val="single" w:sz="4" w:color="999999"/>
+              <w:left w:val="single" w:sz="4" w:color="999999"/>
+              <w:bottom w:val="single" w:sz="4" w:color="999999"/>
+              <w:right w:val="single" w:sz="4" w:color="999999"/>
+            </w:tcBorders>
           </w:tcPr>
           <w:p>
             <w:r/>
@@ -1656,6 +1820,12 @@
         <w:tc>
           <w:tcPr>
             <w:tcW w:type="dxa" w:w="1728"/>
+            <w:tcBorders>
+              <w:top w:val="single" w:sz="4" w:color="999999"/>
+              <w:left w:val="single" w:sz="4" w:color="999999"/>
+              <w:bottom w:val="single" w:sz="4" w:color="999999"/>
+              <w:right w:val="single" w:sz="4" w:color="999999"/>
+            </w:tcBorders>
           </w:tcPr>
           <w:p>
             <w:r/>
@@ -1667,6 +1837,12 @@
         <w:tc>
           <w:tcPr>
             <w:tcW w:type="dxa" w:w="1728"/>
+            <w:tcBorders>
+              <w:top w:val="single" w:sz="4" w:color="999999"/>
+              <w:left w:val="single" w:sz="4" w:color="999999"/>
+              <w:bottom w:val="single" w:sz="4" w:color="999999"/>
+              <w:right w:val="single" w:sz="4" w:color="999999"/>
+            </w:tcBorders>
           </w:tcPr>
           <w:p>
             <w:r/>
@@ -1678,6 +1854,12 @@
         <w:tc>
           <w:tcPr>
             <w:tcW w:type="dxa" w:w="1728"/>
+            <w:tcBorders>
+              <w:top w:val="single" w:sz="4" w:color="999999"/>
+              <w:left w:val="single" w:sz="4" w:color="999999"/>
+              <w:bottom w:val="single" w:sz="4" w:color="999999"/>
+              <w:right w:val="single" w:sz="4" w:color="999999"/>
+            </w:tcBorders>
           </w:tcPr>
           <w:p>
             <w:r/>
@@ -1693,6 +1875,12 @@
         <w:tc>
           <w:tcPr>
             <w:tcW w:type="dxa" w:w="1728"/>
+            <w:tcBorders>
+              <w:top w:val="single" w:sz="4" w:color="999999"/>
+              <w:left w:val="single" w:sz="4" w:color="999999"/>
+              <w:bottom w:val="single" w:sz="4" w:color="999999"/>
+              <w:right w:val="single" w:sz="4" w:color="999999"/>
+            </w:tcBorders>
           </w:tcPr>
           <w:p>
             <w:r/>
@@ -1706,6 +1894,12 @@
         <w:tc>
           <w:tcPr>
             <w:tcW w:type="dxa" w:w="1728"/>
+            <w:tcBorders>
+              <w:top w:val="single" w:sz="4" w:color="999999"/>
+              <w:left w:val="single" w:sz="4" w:color="999999"/>
+              <w:bottom w:val="single" w:sz="4" w:color="999999"/>
+              <w:right w:val="single" w:sz="4" w:color="999999"/>
+            </w:tcBorders>
           </w:tcPr>
           <w:p>
             <w:r/>
@@ -1717,6 +1911,12 @@
         <w:tc>
           <w:tcPr>
             <w:tcW w:type="dxa" w:w="1728"/>
+            <w:tcBorders>
+              <w:top w:val="single" w:sz="4" w:color="999999"/>
+              <w:left w:val="single" w:sz="4" w:color="999999"/>
+              <w:bottom w:val="single" w:sz="4" w:color="999999"/>
+              <w:right w:val="single" w:sz="4" w:color="999999"/>
+            </w:tcBorders>
           </w:tcPr>
           <w:p>
             <w:r/>
@@ -1728,6 +1928,12 @@
         <w:tc>
           <w:tcPr>
             <w:tcW w:type="dxa" w:w="1728"/>
+            <w:tcBorders>
+              <w:top w:val="single" w:sz="4" w:color="999999"/>
+              <w:left w:val="single" w:sz="4" w:color="999999"/>
+              <w:bottom w:val="single" w:sz="4" w:color="999999"/>
+              <w:right w:val="single" w:sz="4" w:color="999999"/>
+            </w:tcBorders>
           </w:tcPr>
           <w:p>
             <w:r/>
@@ -1739,6 +1945,12 @@
         <w:tc>
           <w:tcPr>
             <w:tcW w:type="dxa" w:w="1728"/>
+            <w:tcBorders>
+              <w:top w:val="single" w:sz="4" w:color="999999"/>
+              <w:left w:val="single" w:sz="4" w:color="999999"/>
+              <w:bottom w:val="single" w:sz="4" w:color="999999"/>
+              <w:right w:val="single" w:sz="4" w:color="999999"/>
+            </w:tcBorders>
           </w:tcPr>
           <w:p>
             <w:r/>
@@ -1754,6 +1966,12 @@
         <w:tc>
           <w:tcPr>
             <w:tcW w:type="dxa" w:w="1728"/>
+            <w:tcBorders>
+              <w:top w:val="single" w:sz="4" w:color="999999"/>
+              <w:left w:val="single" w:sz="4" w:color="999999"/>
+              <w:bottom w:val="single" w:sz="4" w:color="999999"/>
+              <w:right w:val="single" w:sz="4" w:color="999999"/>
+            </w:tcBorders>
           </w:tcPr>
           <w:p>
             <w:r/>
@@ -1773,6 +1991,12 @@
         <w:tc>
           <w:tcPr>
             <w:tcW w:type="dxa" w:w="1728"/>
+            <w:tcBorders>
+              <w:top w:val="single" w:sz="4" w:color="999999"/>
+              <w:left w:val="single" w:sz="4" w:color="999999"/>
+              <w:bottom w:val="single" w:sz="4" w:color="999999"/>
+              <w:right w:val="single" w:sz="4" w:color="999999"/>
+            </w:tcBorders>
           </w:tcPr>
           <w:p>
             <w:r/>
@@ -1784,6 +2008,12 @@
         <w:tc>
           <w:tcPr>
             <w:tcW w:type="dxa" w:w="1728"/>
+            <w:tcBorders>
+              <w:top w:val="single" w:sz="4" w:color="999999"/>
+              <w:left w:val="single" w:sz="4" w:color="999999"/>
+              <w:bottom w:val="single" w:sz="4" w:color="999999"/>
+              <w:right w:val="single" w:sz="4" w:color="999999"/>
+            </w:tcBorders>
           </w:tcPr>
           <w:p>
             <w:r/>
@@ -1795,6 +2025,12 @@
         <w:tc>
           <w:tcPr>
             <w:tcW w:type="dxa" w:w="1728"/>
+            <w:tcBorders>
+              <w:top w:val="single" w:sz="4" w:color="999999"/>
+              <w:left w:val="single" w:sz="4" w:color="999999"/>
+              <w:bottom w:val="single" w:sz="4" w:color="999999"/>
+              <w:right w:val="single" w:sz="4" w:color="999999"/>
+            </w:tcBorders>
           </w:tcPr>
           <w:p>
             <w:r/>
@@ -1806,6 +2042,12 @@
         <w:tc>
           <w:tcPr>
             <w:tcW w:type="dxa" w:w="1728"/>
+            <w:tcBorders>
+              <w:top w:val="single" w:sz="4" w:color="999999"/>
+              <w:left w:val="single" w:sz="4" w:color="999999"/>
+              <w:bottom w:val="single" w:sz="4" w:color="999999"/>
+              <w:right w:val="single" w:sz="4" w:color="999999"/>
+            </w:tcBorders>
           </w:tcPr>
           <w:p>
             <w:r/>
@@ -1821,6 +2063,12 @@
         <w:tc>
           <w:tcPr>
             <w:tcW w:type="dxa" w:w="1728"/>
+            <w:tcBorders>
+              <w:top w:val="single" w:sz="4" w:color="999999"/>
+              <w:left w:val="single" w:sz="4" w:color="999999"/>
+              <w:bottom w:val="single" w:sz="4" w:color="999999"/>
+              <w:right w:val="single" w:sz="4" w:color="999999"/>
+            </w:tcBorders>
           </w:tcPr>
           <w:p>
             <w:r/>
@@ -1834,6 +2082,12 @@
         <w:tc>
           <w:tcPr>
             <w:tcW w:type="dxa" w:w="1728"/>
+            <w:tcBorders>
+              <w:top w:val="single" w:sz="4" w:color="999999"/>
+              <w:left w:val="single" w:sz="4" w:color="999999"/>
+              <w:bottom w:val="single" w:sz="4" w:color="999999"/>
+              <w:right w:val="single" w:sz="4" w:color="999999"/>
+            </w:tcBorders>
           </w:tcPr>
           <w:p>
             <w:r/>
@@ -1845,6 +2099,12 @@
         <w:tc>
           <w:tcPr>
             <w:tcW w:type="dxa" w:w="1728"/>
+            <w:tcBorders>
+              <w:top w:val="single" w:sz="4" w:color="999999"/>
+              <w:left w:val="single" w:sz="4" w:color="999999"/>
+              <w:bottom w:val="single" w:sz="4" w:color="999999"/>
+              <w:right w:val="single" w:sz="4" w:color="999999"/>
+            </w:tcBorders>
           </w:tcPr>
           <w:p>
             <w:r/>
@@ -1856,6 +2116,12 @@
         <w:tc>
           <w:tcPr>
             <w:tcW w:type="dxa" w:w="1728"/>
+            <w:tcBorders>
+              <w:top w:val="single" w:sz="4" w:color="999999"/>
+              <w:left w:val="single" w:sz="4" w:color="999999"/>
+              <w:bottom w:val="single" w:sz="4" w:color="999999"/>
+              <w:right w:val="single" w:sz="4" w:color="999999"/>
+            </w:tcBorders>
           </w:tcPr>
           <w:p>
             <w:r/>
@@ -1867,6 +2133,12 @@
         <w:tc>
           <w:tcPr>
             <w:tcW w:type="dxa" w:w="1728"/>
+            <w:tcBorders>
+              <w:top w:val="single" w:sz="4" w:color="999999"/>
+              <w:left w:val="single" w:sz="4" w:color="999999"/>
+              <w:bottom w:val="single" w:sz="4" w:color="999999"/>
+              <w:right w:val="single" w:sz="4" w:color="999999"/>
+            </w:tcBorders>
           </w:tcPr>
           <w:p>
             <w:r/>
@@ -1885,6 +2157,12 @@
         <w:tc>
           <w:tcPr>
             <w:tcW w:type="dxa" w:w="1728"/>
+            <w:tcBorders>
+              <w:top w:val="single" w:sz="4" w:color="999999"/>
+              <w:left w:val="single" w:sz="4" w:color="999999"/>
+              <w:bottom w:val="single" w:sz="4" w:color="999999"/>
+              <w:right w:val="single" w:sz="4" w:color="999999"/>
+            </w:tcBorders>
           </w:tcPr>
           <w:p>
             <w:r/>
@@ -1898,6 +2176,12 @@
         <w:tc>
           <w:tcPr>
             <w:tcW w:type="dxa" w:w="1728"/>
+            <w:tcBorders>
+              <w:top w:val="single" w:sz="4" w:color="999999"/>
+              <w:left w:val="single" w:sz="4" w:color="999999"/>
+              <w:bottom w:val="single" w:sz="4" w:color="999999"/>
+              <w:right w:val="single" w:sz="4" w:color="999999"/>
+            </w:tcBorders>
           </w:tcPr>
           <w:p>
             <w:r/>
@@ -1909,6 +2193,12 @@
         <w:tc>
           <w:tcPr>
             <w:tcW w:type="dxa" w:w="1728"/>
+            <w:tcBorders>
+              <w:top w:val="single" w:sz="4" w:color="999999"/>
+              <w:left w:val="single" w:sz="4" w:color="999999"/>
+              <w:bottom w:val="single" w:sz="4" w:color="999999"/>
+              <w:right w:val="single" w:sz="4" w:color="999999"/>
+            </w:tcBorders>
           </w:tcPr>
           <w:p>
             <w:r/>
@@ -1920,6 +2210,12 @@
         <w:tc>
           <w:tcPr>
             <w:tcW w:type="dxa" w:w="1728"/>
+            <w:tcBorders>
+              <w:top w:val="single" w:sz="4" w:color="999999"/>
+              <w:left w:val="single" w:sz="4" w:color="999999"/>
+              <w:bottom w:val="single" w:sz="4" w:color="999999"/>
+              <w:right w:val="single" w:sz="4" w:color="999999"/>
+            </w:tcBorders>
           </w:tcPr>
           <w:p>
             <w:r/>
@@ -1937,6 +2233,12 @@
         <w:tc>
           <w:tcPr>
             <w:tcW w:type="dxa" w:w="1728"/>
+            <w:tcBorders>
+              <w:top w:val="single" w:sz="4" w:color="999999"/>
+              <w:left w:val="single" w:sz="4" w:color="999999"/>
+              <w:bottom w:val="single" w:sz="4" w:color="999999"/>
+              <w:right w:val="single" w:sz="4" w:color="999999"/>
+            </w:tcBorders>
           </w:tcPr>
           <w:p>
             <w:r/>
@@ -1955,6 +2257,12 @@
         <w:tc>
           <w:tcPr>
             <w:tcW w:type="dxa" w:w="1728"/>
+            <w:tcBorders>
+              <w:top w:val="single" w:sz="4" w:color="999999"/>
+              <w:left w:val="single" w:sz="4" w:color="999999"/>
+              <w:bottom w:val="single" w:sz="4" w:color="999999"/>
+              <w:right w:val="single" w:sz="4" w:color="999999"/>
+            </w:tcBorders>
           </w:tcPr>
           <w:p>
             <w:r/>
@@ -1968,6 +2276,12 @@
         <w:tc>
           <w:tcPr>
             <w:tcW w:type="dxa" w:w="1728"/>
+            <w:tcBorders>
+              <w:top w:val="single" w:sz="4" w:color="999999"/>
+              <w:left w:val="single" w:sz="4" w:color="999999"/>
+              <w:bottom w:val="single" w:sz="4" w:color="999999"/>
+              <w:right w:val="single" w:sz="4" w:color="999999"/>
+            </w:tcBorders>
           </w:tcPr>
           <w:p>
             <w:r/>
@@ -1979,6 +2293,12 @@
         <w:tc>
           <w:tcPr>
             <w:tcW w:type="dxa" w:w="1728"/>
+            <w:tcBorders>
+              <w:top w:val="single" w:sz="4" w:color="999999"/>
+              <w:left w:val="single" w:sz="4" w:color="999999"/>
+              <w:bottom w:val="single" w:sz="4" w:color="999999"/>
+              <w:right w:val="single" w:sz="4" w:color="999999"/>
+            </w:tcBorders>
           </w:tcPr>
           <w:p>
             <w:r/>
@@ -1990,6 +2310,12 @@
         <w:tc>
           <w:tcPr>
             <w:tcW w:type="dxa" w:w="1728"/>
+            <w:tcBorders>
+              <w:top w:val="single" w:sz="4" w:color="999999"/>
+              <w:left w:val="single" w:sz="4" w:color="999999"/>
+              <w:bottom w:val="single" w:sz="4" w:color="999999"/>
+              <w:right w:val="single" w:sz="4" w:color="999999"/>
+            </w:tcBorders>
           </w:tcPr>
           <w:p>
             <w:r/>
@@ -2019,6 +2345,12 @@
         <w:tc>
           <w:tcPr>
             <w:tcW w:type="dxa" w:w="1728"/>
+            <w:tcBorders>
+              <w:top w:val="single" w:sz="4" w:color="999999"/>
+              <w:left w:val="single" w:sz="4" w:color="999999"/>
+              <w:bottom w:val="single" w:sz="4" w:color="999999"/>
+              <w:right w:val="single" w:sz="4" w:color="999999"/>
+            </w:tcBorders>
           </w:tcPr>
           <w:p>
             <w:r/>
@@ -2034,6 +2366,12 @@
         <w:tc>
           <w:tcPr>
             <w:tcW w:type="dxa" w:w="1728"/>
+            <w:tcBorders>
+              <w:top w:val="single" w:sz="4" w:color="999999"/>
+              <w:left w:val="single" w:sz="4" w:color="999999"/>
+              <w:bottom w:val="single" w:sz="4" w:color="999999"/>
+              <w:right w:val="single" w:sz="4" w:color="999999"/>
+            </w:tcBorders>
           </w:tcPr>
           <w:p>
             <w:r/>
@@ -2047,6 +2385,12 @@
         <w:tc>
           <w:tcPr>
             <w:tcW w:type="dxa" w:w="1728"/>
+            <w:tcBorders>
+              <w:top w:val="single" w:sz="4" w:color="999999"/>
+              <w:left w:val="single" w:sz="4" w:color="999999"/>
+              <w:bottom w:val="single" w:sz="4" w:color="999999"/>
+              <w:right w:val="single" w:sz="4" w:color="999999"/>
+            </w:tcBorders>
           </w:tcPr>
           <w:p>
             <w:r/>
@@ -2058,6 +2402,12 @@
         <w:tc>
           <w:tcPr>
             <w:tcW w:type="dxa" w:w="1728"/>
+            <w:tcBorders>
+              <w:top w:val="single" w:sz="4" w:color="999999"/>
+              <w:left w:val="single" w:sz="4" w:color="999999"/>
+              <w:bottom w:val="single" w:sz="4" w:color="999999"/>
+              <w:right w:val="single" w:sz="4" w:color="999999"/>
+            </w:tcBorders>
           </w:tcPr>
           <w:p>
             <w:r/>
@@ -2069,6 +2419,12 @@
         <w:tc>
           <w:tcPr>
             <w:tcW w:type="dxa" w:w="1728"/>
+            <w:tcBorders>
+              <w:top w:val="single" w:sz="4" w:color="999999"/>
+              <w:left w:val="single" w:sz="4" w:color="999999"/>
+              <w:bottom w:val="single" w:sz="4" w:color="999999"/>
+              <w:right w:val="single" w:sz="4" w:color="999999"/>
+            </w:tcBorders>
           </w:tcPr>
           <w:p>
             <w:r/>
@@ -2080,6 +2436,12 @@
         <w:tc>
           <w:tcPr>
             <w:tcW w:type="dxa" w:w="1728"/>
+            <w:tcBorders>
+              <w:top w:val="single" w:sz="4" w:color="999999"/>
+              <w:left w:val="single" w:sz="4" w:color="999999"/>
+              <w:bottom w:val="single" w:sz="4" w:color="999999"/>
+              <w:right w:val="single" w:sz="4" w:color="999999"/>
+            </w:tcBorders>
           </w:tcPr>
           <w:p>
             <w:r/>
@@ -2091,6 +2453,12 @@
         <w:tc>
           <w:tcPr>
             <w:tcW w:type="dxa" w:w="1728"/>
+            <w:tcBorders>
+              <w:top w:val="single" w:sz="4" w:color="999999"/>
+              <w:left w:val="single" w:sz="4" w:color="999999"/>
+              <w:bottom w:val="single" w:sz="4" w:color="999999"/>
+              <w:right w:val="single" w:sz="4" w:color="999999"/>
+            </w:tcBorders>
           </w:tcPr>
           <w:p>
             <w:r/>
@@ -2104,6 +2472,12 @@
         <w:tc>
           <w:tcPr>
             <w:tcW w:type="dxa" w:w="1728"/>
+            <w:tcBorders>
+              <w:top w:val="single" w:sz="4" w:color="999999"/>
+              <w:left w:val="single" w:sz="4" w:color="999999"/>
+              <w:bottom w:val="single" w:sz="4" w:color="999999"/>
+              <w:right w:val="single" w:sz="4" w:color="999999"/>
+            </w:tcBorders>
           </w:tcPr>
           <w:p>
             <w:r/>
@@ -2115,6 +2489,12 @@
         <w:tc>
           <w:tcPr>
             <w:tcW w:type="dxa" w:w="1728"/>
+            <w:tcBorders>
+              <w:top w:val="single" w:sz="4" w:color="999999"/>
+              <w:left w:val="single" w:sz="4" w:color="999999"/>
+              <w:bottom w:val="single" w:sz="4" w:color="999999"/>
+              <w:right w:val="single" w:sz="4" w:color="999999"/>
+            </w:tcBorders>
           </w:tcPr>
           <w:p>
             <w:r/>
@@ -2126,6 +2506,12 @@
         <w:tc>
           <w:tcPr>
             <w:tcW w:type="dxa" w:w="1728"/>
+            <w:tcBorders>
+              <w:top w:val="single" w:sz="4" w:color="999999"/>
+              <w:left w:val="single" w:sz="4" w:color="999999"/>
+              <w:bottom w:val="single" w:sz="4" w:color="999999"/>
+              <w:right w:val="single" w:sz="4" w:color="999999"/>
+            </w:tcBorders>
           </w:tcPr>
           <w:p>
             <w:r/>
@@ -2137,6 +2523,12 @@
         <w:tc>
           <w:tcPr>
             <w:tcW w:type="dxa" w:w="1728"/>
+            <w:tcBorders>
+              <w:top w:val="single" w:sz="4" w:color="999999"/>
+              <w:left w:val="single" w:sz="4" w:color="999999"/>
+              <w:bottom w:val="single" w:sz="4" w:color="999999"/>
+              <w:right w:val="single" w:sz="4" w:color="999999"/>
+            </w:tcBorders>
           </w:tcPr>
           <w:p>
             <w:r/>
@@ -2155,6 +2547,12 @@
         <w:tc>
           <w:tcPr>
             <w:tcW w:type="dxa" w:w="1728"/>
+            <w:tcBorders>
+              <w:top w:val="single" w:sz="4" w:color="999999"/>
+              <w:left w:val="single" w:sz="4" w:color="999999"/>
+              <w:bottom w:val="single" w:sz="4" w:color="999999"/>
+              <w:right w:val="single" w:sz="4" w:color="999999"/>
+            </w:tcBorders>
           </w:tcPr>
           <w:p>
             <w:r/>
@@ -2168,6 +2566,12 @@
         <w:tc>
           <w:tcPr>
             <w:tcW w:type="dxa" w:w="1728"/>
+            <w:tcBorders>
+              <w:top w:val="single" w:sz="4" w:color="999999"/>
+              <w:left w:val="single" w:sz="4" w:color="999999"/>
+              <w:bottom w:val="single" w:sz="4" w:color="999999"/>
+              <w:right w:val="single" w:sz="4" w:color="999999"/>
+            </w:tcBorders>
           </w:tcPr>
           <w:p>
             <w:r/>
@@ -2179,6 +2583,12 @@
         <w:tc>
           <w:tcPr>
             <w:tcW w:type="dxa" w:w="1728"/>
+            <w:tcBorders>
+              <w:top w:val="single" w:sz="4" w:color="999999"/>
+              <w:left w:val="single" w:sz="4" w:color="999999"/>
+              <w:bottom w:val="single" w:sz="4" w:color="999999"/>
+              <w:right w:val="single" w:sz="4" w:color="999999"/>
+            </w:tcBorders>
           </w:tcPr>
           <w:p>
             <w:r/>
@@ -2190,6 +2600,12 @@
         <w:tc>
           <w:tcPr>
             <w:tcW w:type="dxa" w:w="1728"/>
+            <w:tcBorders>
+              <w:top w:val="single" w:sz="4" w:color="999999"/>
+              <w:left w:val="single" w:sz="4" w:color="999999"/>
+              <w:bottom w:val="single" w:sz="4" w:color="999999"/>
+              <w:right w:val="single" w:sz="4" w:color="999999"/>
+            </w:tcBorders>
           </w:tcPr>
           <w:p>
             <w:r/>
@@ -2201,6 +2617,12 @@
         <w:tc>
           <w:tcPr>
             <w:tcW w:type="dxa" w:w="1728"/>
+            <w:tcBorders>
+              <w:top w:val="single" w:sz="4" w:color="999999"/>
+              <w:left w:val="single" w:sz="4" w:color="999999"/>
+              <w:bottom w:val="single" w:sz="4" w:color="999999"/>
+              <w:right w:val="single" w:sz="4" w:color="999999"/>
+            </w:tcBorders>
           </w:tcPr>
           <w:p>
             <w:r/>
@@ -2212,6 +2634,12 @@
         <w:tc>
           <w:tcPr>
             <w:tcW w:type="dxa" w:w="1728"/>
+            <w:tcBorders>
+              <w:top w:val="single" w:sz="4" w:color="999999"/>
+              <w:left w:val="single" w:sz="4" w:color="999999"/>
+              <w:bottom w:val="single" w:sz="4" w:color="999999"/>
+              <w:right w:val="single" w:sz="4" w:color="999999"/>
+            </w:tcBorders>
           </w:tcPr>
           <w:p>
             <w:r/>
@@ -2225,6 +2653,12 @@
         <w:tc>
           <w:tcPr>
             <w:tcW w:type="dxa" w:w="1728"/>
+            <w:tcBorders>
+              <w:top w:val="single" w:sz="4" w:color="999999"/>
+              <w:left w:val="single" w:sz="4" w:color="999999"/>
+              <w:bottom w:val="single" w:sz="4" w:color="999999"/>
+              <w:right w:val="single" w:sz="4" w:color="999999"/>
+            </w:tcBorders>
           </w:tcPr>
           <w:p>
             <w:r/>
@@ -2236,6 +2670,12 @@
         <w:tc>
           <w:tcPr>
             <w:tcW w:type="dxa" w:w="1728"/>
+            <w:tcBorders>
+              <w:top w:val="single" w:sz="4" w:color="999999"/>
+              <w:left w:val="single" w:sz="4" w:color="999999"/>
+              <w:bottom w:val="single" w:sz="4" w:color="999999"/>
+              <w:right w:val="single" w:sz="4" w:color="999999"/>
+            </w:tcBorders>
           </w:tcPr>
           <w:p>
             <w:r/>
@@ -2247,6 +2687,12 @@
         <w:tc>
           <w:tcPr>
             <w:tcW w:type="dxa" w:w="1728"/>
+            <w:tcBorders>
+              <w:top w:val="single" w:sz="4" w:color="999999"/>
+              <w:left w:val="single" w:sz="4" w:color="999999"/>
+              <w:bottom w:val="single" w:sz="4" w:color="999999"/>
+              <w:right w:val="single" w:sz="4" w:color="999999"/>
+            </w:tcBorders>
           </w:tcPr>
           <w:p>
             <w:r/>
@@ -2258,6 +2704,12 @@
         <w:tc>
           <w:tcPr>
             <w:tcW w:type="dxa" w:w="1728"/>
+            <w:tcBorders>
+              <w:top w:val="single" w:sz="4" w:color="999999"/>
+              <w:left w:val="single" w:sz="4" w:color="999999"/>
+              <w:bottom w:val="single" w:sz="4" w:color="999999"/>
+              <w:right w:val="single" w:sz="4" w:color="999999"/>
+            </w:tcBorders>
           </w:tcPr>
           <w:p>
             <w:r/>
@@ -2276,6 +2728,12 @@
         <w:tc>
           <w:tcPr>
             <w:tcW w:type="dxa" w:w="1728"/>
+            <w:tcBorders>
+              <w:top w:val="single" w:sz="4" w:color="999999"/>
+              <w:left w:val="single" w:sz="4" w:color="999999"/>
+              <w:bottom w:val="single" w:sz="4" w:color="999999"/>
+              <w:right w:val="single" w:sz="4" w:color="999999"/>
+            </w:tcBorders>
           </w:tcPr>
           <w:p>
             <w:r/>
@@ -2289,6 +2747,12 @@
         <w:tc>
           <w:tcPr>
             <w:tcW w:type="dxa" w:w="1728"/>
+            <w:tcBorders>
+              <w:top w:val="single" w:sz="4" w:color="999999"/>
+              <w:left w:val="single" w:sz="4" w:color="999999"/>
+              <w:bottom w:val="single" w:sz="4" w:color="999999"/>
+              <w:right w:val="single" w:sz="4" w:color="999999"/>
+            </w:tcBorders>
           </w:tcPr>
           <w:p>
             <w:r/>
@@ -2300,6 +2764,12 @@
         <w:tc>
           <w:tcPr>
             <w:tcW w:type="dxa" w:w="1728"/>
+            <w:tcBorders>
+              <w:top w:val="single" w:sz="4" w:color="999999"/>
+              <w:left w:val="single" w:sz="4" w:color="999999"/>
+              <w:bottom w:val="single" w:sz="4" w:color="999999"/>
+              <w:right w:val="single" w:sz="4" w:color="999999"/>
+            </w:tcBorders>
           </w:tcPr>
           <w:p>
             <w:r/>
@@ -2311,6 +2781,12 @@
         <w:tc>
           <w:tcPr>
             <w:tcW w:type="dxa" w:w="1728"/>
+            <w:tcBorders>
+              <w:top w:val="single" w:sz="4" w:color="999999"/>
+              <w:left w:val="single" w:sz="4" w:color="999999"/>
+              <w:bottom w:val="single" w:sz="4" w:color="999999"/>
+              <w:right w:val="single" w:sz="4" w:color="999999"/>
+            </w:tcBorders>
           </w:tcPr>
           <w:p>
             <w:r/>
@@ -2322,6 +2798,12 @@
         <w:tc>
           <w:tcPr>
             <w:tcW w:type="dxa" w:w="1728"/>
+            <w:tcBorders>
+              <w:top w:val="single" w:sz="4" w:color="999999"/>
+              <w:left w:val="single" w:sz="4" w:color="999999"/>
+              <w:bottom w:val="single" w:sz="4" w:color="999999"/>
+              <w:right w:val="single" w:sz="4" w:color="999999"/>
+            </w:tcBorders>
           </w:tcPr>
           <w:p>
             <w:r/>
@@ -2340,6 +2822,12 @@
         <w:tc>
           <w:tcPr>
             <w:tcW w:type="dxa" w:w="1728"/>
+            <w:tcBorders>
+              <w:top w:val="single" w:sz="4" w:color="999999"/>
+              <w:left w:val="single" w:sz="4" w:color="999999"/>
+              <w:bottom w:val="single" w:sz="4" w:color="999999"/>
+              <w:right w:val="single" w:sz="4" w:color="999999"/>
+            </w:tcBorders>
           </w:tcPr>
           <w:p>
             <w:r/>
@@ -2353,6 +2841,12 @@
         <w:tc>
           <w:tcPr>
             <w:tcW w:type="dxa" w:w="1728"/>
+            <w:tcBorders>
+              <w:top w:val="single" w:sz="4" w:color="999999"/>
+              <w:left w:val="single" w:sz="4" w:color="999999"/>
+              <w:bottom w:val="single" w:sz="4" w:color="999999"/>
+              <w:right w:val="single" w:sz="4" w:color="999999"/>
+            </w:tcBorders>
           </w:tcPr>
           <w:p>
             <w:r/>
@@ -2364,6 +2858,12 @@
         <w:tc>
           <w:tcPr>
             <w:tcW w:type="dxa" w:w="1728"/>
+            <w:tcBorders>
+              <w:top w:val="single" w:sz="4" w:color="999999"/>
+              <w:left w:val="single" w:sz="4" w:color="999999"/>
+              <w:bottom w:val="single" w:sz="4" w:color="999999"/>
+              <w:right w:val="single" w:sz="4" w:color="999999"/>
+            </w:tcBorders>
           </w:tcPr>
           <w:p>
             <w:r/>
@@ -2375,6 +2875,12 @@
         <w:tc>
           <w:tcPr>
             <w:tcW w:type="dxa" w:w="1728"/>
+            <w:tcBorders>
+              <w:top w:val="single" w:sz="4" w:color="999999"/>
+              <w:left w:val="single" w:sz="4" w:color="999999"/>
+              <w:bottom w:val="single" w:sz="4" w:color="999999"/>
+              <w:right w:val="single" w:sz="4" w:color="999999"/>
+            </w:tcBorders>
           </w:tcPr>
           <w:p>
             <w:r/>
@@ -2386,6 +2892,12 @@
         <w:tc>
           <w:tcPr>
             <w:tcW w:type="dxa" w:w="1728"/>
+            <w:tcBorders>
+              <w:top w:val="single" w:sz="4" w:color="999999"/>
+              <w:left w:val="single" w:sz="4" w:color="999999"/>
+              <w:bottom w:val="single" w:sz="4" w:color="999999"/>
+              <w:right w:val="single" w:sz="4" w:color="999999"/>
+            </w:tcBorders>
           </w:tcPr>
           <w:p>
             <w:r/>
@@ -2404,6 +2916,12 @@
         <w:tc>
           <w:tcPr>
             <w:tcW w:type="dxa" w:w="1728"/>
+            <w:tcBorders>
+              <w:top w:val="single" w:sz="4" w:color="999999"/>
+              <w:left w:val="single" w:sz="4" w:color="999999"/>
+              <w:bottom w:val="single" w:sz="4" w:color="999999"/>
+              <w:right w:val="single" w:sz="4" w:color="999999"/>
+            </w:tcBorders>
           </w:tcPr>
           <w:p>
             <w:r/>
@@ -2417,6 +2935,12 @@
         <w:tc>
           <w:tcPr>
             <w:tcW w:type="dxa" w:w="1728"/>
+            <w:tcBorders>
+              <w:top w:val="single" w:sz="4" w:color="999999"/>
+              <w:left w:val="single" w:sz="4" w:color="999999"/>
+              <w:bottom w:val="single" w:sz="4" w:color="999999"/>
+              <w:right w:val="single" w:sz="4" w:color="999999"/>
+            </w:tcBorders>
           </w:tcPr>
           <w:p>
             <w:r/>
@@ -2428,6 +2952,12 @@
         <w:tc>
           <w:tcPr>
             <w:tcW w:type="dxa" w:w="1728"/>
+            <w:tcBorders>
+              <w:top w:val="single" w:sz="4" w:color="999999"/>
+              <w:left w:val="single" w:sz="4" w:color="999999"/>
+              <w:bottom w:val="single" w:sz="4" w:color="999999"/>
+              <w:right w:val="single" w:sz="4" w:color="999999"/>
+            </w:tcBorders>
           </w:tcPr>
           <w:p>
             <w:r/>
@@ -2439,6 +2969,12 @@
         <w:tc>
           <w:tcPr>
             <w:tcW w:type="dxa" w:w="1728"/>
+            <w:tcBorders>
+              <w:top w:val="single" w:sz="4" w:color="999999"/>
+              <w:left w:val="single" w:sz="4" w:color="999999"/>
+              <w:bottom w:val="single" w:sz="4" w:color="999999"/>
+              <w:right w:val="single" w:sz="4" w:color="999999"/>
+            </w:tcBorders>
           </w:tcPr>
           <w:p>
             <w:r/>
@@ -2450,6 +2986,12 @@
         <w:tc>
           <w:tcPr>
             <w:tcW w:type="dxa" w:w="1728"/>
+            <w:tcBorders>
+              <w:top w:val="single" w:sz="4" w:color="999999"/>
+              <w:left w:val="single" w:sz="4" w:color="999999"/>
+              <w:bottom w:val="single" w:sz="4" w:color="999999"/>
+              <w:right w:val="single" w:sz="4" w:color="999999"/>
+            </w:tcBorders>
           </w:tcPr>
           <w:p>
             <w:r/>
@@ -2461,6 +3003,12 @@
         <w:tc>
           <w:tcPr>
             <w:tcW w:type="dxa" w:w="1728"/>
+            <w:tcBorders>
+              <w:top w:val="single" w:sz="4" w:color="999999"/>
+              <w:left w:val="single" w:sz="4" w:color="999999"/>
+              <w:bottom w:val="single" w:sz="4" w:color="999999"/>
+              <w:right w:val="single" w:sz="4" w:color="999999"/>
+            </w:tcBorders>
           </w:tcPr>
           <w:p>
             <w:r/>
@@ -2474,6 +3022,12 @@
         <w:tc>
           <w:tcPr>
             <w:tcW w:type="dxa" w:w="1728"/>
+            <w:tcBorders>
+              <w:top w:val="single" w:sz="4" w:color="999999"/>
+              <w:left w:val="single" w:sz="4" w:color="999999"/>
+              <w:bottom w:val="single" w:sz="4" w:color="999999"/>
+              <w:right w:val="single" w:sz="4" w:color="999999"/>
+            </w:tcBorders>
           </w:tcPr>
           <w:p>
             <w:r/>
@@ -2485,6 +3039,12 @@
         <w:tc>
           <w:tcPr>
             <w:tcW w:type="dxa" w:w="1728"/>
+            <w:tcBorders>
+              <w:top w:val="single" w:sz="4" w:color="999999"/>
+              <w:left w:val="single" w:sz="4" w:color="999999"/>
+              <w:bottom w:val="single" w:sz="4" w:color="999999"/>
+              <w:right w:val="single" w:sz="4" w:color="999999"/>
+            </w:tcBorders>
           </w:tcPr>
           <w:p>
             <w:r/>
@@ -2496,6 +3056,12 @@
         <w:tc>
           <w:tcPr>
             <w:tcW w:type="dxa" w:w="1728"/>
+            <w:tcBorders>
+              <w:top w:val="single" w:sz="4" w:color="999999"/>
+              <w:left w:val="single" w:sz="4" w:color="999999"/>
+              <w:bottom w:val="single" w:sz="4" w:color="999999"/>
+              <w:right w:val="single" w:sz="4" w:color="999999"/>
+            </w:tcBorders>
           </w:tcPr>
           <w:p>
             <w:r/>
@@ -2507,6 +3073,12 @@
         <w:tc>
           <w:tcPr>
             <w:tcW w:type="dxa" w:w="1728"/>
+            <w:tcBorders>
+              <w:top w:val="single" w:sz="4" w:color="999999"/>
+              <w:left w:val="single" w:sz="4" w:color="999999"/>
+              <w:bottom w:val="single" w:sz="4" w:color="999999"/>
+              <w:right w:val="single" w:sz="4" w:color="999999"/>
+            </w:tcBorders>
           </w:tcPr>
           <w:p>
             <w:r/>
@@ -2525,6 +3097,12 @@
         <w:tc>
           <w:tcPr>
             <w:tcW w:type="dxa" w:w="1728"/>
+            <w:tcBorders>
+              <w:top w:val="single" w:sz="4" w:color="999999"/>
+              <w:left w:val="single" w:sz="4" w:color="999999"/>
+              <w:bottom w:val="single" w:sz="4" w:color="999999"/>
+              <w:right w:val="single" w:sz="4" w:color="999999"/>
+            </w:tcBorders>
           </w:tcPr>
           <w:p>
             <w:r/>
@@ -2538,7 +3116,7 @@
     <w:p/>
     <w:p>
       <w:pPr>
-        <w:pStyle w:val="Heading2"/>
+        <w:pStyle w:val="Heading3"/>
       </w:pPr>
       <w:r>
         <w:t>Multi-shop Minimum Commitment allocation (check 8)</w:t>
@@ -2616,7 +3194,7 @@
     </w:p>
     <w:p>
       <w:pPr>
-        <w:pStyle w:val="Heading2"/>
+        <w:pStyle w:val="Heading3"/>
       </w:pPr>
       <w:r>
         <w:t>Output format</w:t>
@@ -2731,16 +3309,8 @@
       </w:r>
     </w:p>
     <w:p>
-      <w:r>
-        <w:rPr>
-          <w:color w:val="BBBBBB"/>
-        </w:rPr>
-        <w:t>________________________________________</w:t>
-      </w:r>
-    </w:p>
-    <w:p>
       <w:pPr>
-        <w:pStyle w:val="Heading1"/>
+        <w:pStyle w:val="Heading2"/>
       </w:pPr>
       <w:r>
         <w:t>6. Channel routing &amp; per-individual tagging</w:t>
@@ -2773,7 +3343,7 @@
     </w:p>
     <w:tbl>
       <w:tblPr>
-        <w:tblStyle w:val="LightGrid-Accent1"/>
+        <w:tblStyle w:val="TableGrid"/>
         <w:tblW w:type="auto" w:w="0"/>
         <w:tblLook w:firstColumn="1" w:firstRow="1" w:lastColumn="0" w:lastRow="0" w:noHBand="0" w:noVBand="1" w:val="04A0"/>
       </w:tblPr>
@@ -2785,6 +3355,12 @@
         <w:tc>
           <w:tcPr>
             <w:tcW w:type="dxa" w:w="4320"/>
+            <w:tcBorders>
+              <w:top w:val="single" w:sz="4" w:color="999999"/>
+              <w:left w:val="single" w:sz="4" w:color="999999"/>
+              <w:bottom w:val="single" w:sz="4" w:color="999999"/>
+              <w:right w:val="single" w:sz="4" w:color="999999"/>
+            </w:tcBorders>
           </w:tcPr>
           <w:p>
             <w:r>
@@ -2803,6 +3379,12 @@
         <w:tc>
           <w:tcPr>
             <w:tcW w:type="dxa" w:w="4320"/>
+            <w:tcBorders>
+              <w:top w:val="single" w:sz="4" w:color="999999"/>
+              <w:left w:val="single" w:sz="4" w:color="999999"/>
+              <w:bottom w:val="single" w:sz="4" w:color="999999"/>
+              <w:right w:val="single" w:sz="4" w:color="999999"/>
+            </w:tcBorders>
           </w:tcPr>
           <w:p>
             <w:r>
@@ -2823,6 +3405,12 @@
         <w:tc>
           <w:tcPr>
             <w:tcW w:type="dxa" w:w="4320"/>
+            <w:tcBorders>
+              <w:top w:val="single" w:sz="4" w:color="999999"/>
+              <w:left w:val="single" w:sz="4" w:color="999999"/>
+              <w:bottom w:val="single" w:sz="4" w:color="999999"/>
+              <w:right w:val="single" w:sz="4" w:color="999999"/>
+            </w:tcBorders>
           </w:tcPr>
           <w:p>
             <w:r/>
@@ -2834,6 +3422,12 @@
         <w:tc>
           <w:tcPr>
             <w:tcW w:type="dxa" w:w="4320"/>
+            <w:tcBorders>
+              <w:top w:val="single" w:sz="4" w:color="999999"/>
+              <w:left w:val="single" w:sz="4" w:color="999999"/>
+              <w:bottom w:val="single" w:sz="4" w:color="999999"/>
+              <w:right w:val="single" w:sz="4" w:color="999999"/>
+            </w:tcBorders>
           </w:tcPr>
           <w:p>
             <w:r/>
@@ -2850,6 +3444,12 @@
         <w:tc>
           <w:tcPr>
             <w:tcW w:type="dxa" w:w="4320"/>
+            <w:tcBorders>
+              <w:top w:val="single" w:sz="4" w:color="999999"/>
+              <w:left w:val="single" w:sz="4" w:color="999999"/>
+              <w:bottom w:val="single" w:sz="4" w:color="999999"/>
+              <w:right w:val="single" w:sz="4" w:color="999999"/>
+            </w:tcBorders>
           </w:tcPr>
           <w:p>
             <w:r/>
@@ -2861,6 +3461,12 @@
         <w:tc>
           <w:tcPr>
             <w:tcW w:type="dxa" w:w="4320"/>
+            <w:tcBorders>
+              <w:top w:val="single" w:sz="4" w:color="999999"/>
+              <w:left w:val="single" w:sz="4" w:color="999999"/>
+              <w:bottom w:val="single" w:sz="4" w:color="999999"/>
+              <w:right w:val="single" w:sz="4" w:color="999999"/>
+            </w:tcBorders>
           </w:tcPr>
           <w:p>
             <w:r/>
@@ -2877,6 +3483,12 @@
         <w:tc>
           <w:tcPr>
             <w:tcW w:type="dxa" w:w="4320"/>
+            <w:tcBorders>
+              <w:top w:val="single" w:sz="4" w:color="999999"/>
+              <w:left w:val="single" w:sz="4" w:color="999999"/>
+              <w:bottom w:val="single" w:sz="4" w:color="999999"/>
+              <w:right w:val="single" w:sz="4" w:color="999999"/>
+            </w:tcBorders>
           </w:tcPr>
           <w:p>
             <w:r/>
@@ -2894,6 +3506,12 @@
         <w:tc>
           <w:tcPr>
             <w:tcW w:type="dxa" w:w="4320"/>
+            <w:tcBorders>
+              <w:top w:val="single" w:sz="4" w:color="999999"/>
+              <w:left w:val="single" w:sz="4" w:color="999999"/>
+              <w:bottom w:val="single" w:sz="4" w:color="999999"/>
+              <w:right w:val="single" w:sz="4" w:color="999999"/>
+            </w:tcBorders>
           </w:tcPr>
           <w:p>
             <w:r/>
@@ -3023,16 +3641,8 @@
       </w:r>
     </w:p>
     <w:p>
-      <w:r>
-        <w:rPr>
-          <w:color w:val="BBBBBB"/>
-        </w:rPr>
-        <w:t>________________________________________</w:t>
-      </w:r>
-    </w:p>
-    <w:p>
       <w:pPr>
-        <w:pStyle w:val="Heading1"/>
+        <w:pStyle w:val="Heading2"/>
       </w:pPr>
       <w:r>
         <w:t>7. Known gotchas &amp; lessons learned (operational playbook)</w:t>
@@ -3040,7 +3650,7 @@
     </w:p>
     <w:tbl>
       <w:tblPr>
-        <w:tblStyle w:val="LightGrid-Accent1"/>
+        <w:tblStyle w:val="TableGrid"/>
         <w:tblW w:type="auto" w:w="0"/>
         <w:tblLook w:firstColumn="1" w:firstRow="1" w:lastColumn="0" w:lastRow="0" w:noHBand="0" w:noVBand="1" w:val="04A0"/>
       </w:tblPr>
@@ -3053,6 +3663,12 @@
         <w:tc>
           <w:tcPr>
             <w:tcW w:type="dxa" w:w="2880"/>
+            <w:tcBorders>
+              <w:top w:val="single" w:sz="4" w:color="999999"/>
+              <w:left w:val="single" w:sz="4" w:color="999999"/>
+              <w:bottom w:val="single" w:sz="4" w:color="999999"/>
+              <w:right w:val="single" w:sz="4" w:color="999999"/>
+            </w:tcBorders>
           </w:tcPr>
           <w:p>
             <w:r>
@@ -3071,6 +3687,12 @@
         <w:tc>
           <w:tcPr>
             <w:tcW w:type="dxa" w:w="2880"/>
+            <w:tcBorders>
+              <w:top w:val="single" w:sz="4" w:color="999999"/>
+              <w:left w:val="single" w:sz="4" w:color="999999"/>
+              <w:bottom w:val="single" w:sz="4" w:color="999999"/>
+              <w:right w:val="single" w:sz="4" w:color="999999"/>
+            </w:tcBorders>
           </w:tcPr>
           <w:p>
             <w:r>
@@ -3089,6 +3711,12 @@
         <w:tc>
           <w:tcPr>
             <w:tcW w:type="dxa" w:w="2880"/>
+            <w:tcBorders>
+              <w:top w:val="single" w:sz="4" w:color="999999"/>
+              <w:left w:val="single" w:sz="4" w:color="999999"/>
+              <w:bottom w:val="single" w:sz="4" w:color="999999"/>
+              <w:right w:val="single" w:sz="4" w:color="999999"/>
+            </w:tcBorders>
           </w:tcPr>
           <w:p>
             <w:r>
@@ -3109,6 +3737,12 @@
         <w:tc>
           <w:tcPr>
             <w:tcW w:type="dxa" w:w="2880"/>
+            <w:tcBorders>
+              <w:top w:val="single" w:sz="4" w:color="999999"/>
+              <w:left w:val="single" w:sz="4" w:color="999999"/>
+              <w:bottom w:val="single" w:sz="4" w:color="999999"/>
+              <w:right w:val="single" w:sz="4" w:color="999999"/>
+            </w:tcBorders>
           </w:tcPr>
           <w:p>
             <w:r/>
@@ -3120,6 +3754,12 @@
         <w:tc>
           <w:tcPr>
             <w:tcW w:type="dxa" w:w="2880"/>
+            <w:tcBorders>
+              <w:top w:val="single" w:sz="4" w:color="999999"/>
+              <w:left w:val="single" w:sz="4" w:color="999999"/>
+              <w:bottom w:val="single" w:sz="4" w:color="999999"/>
+              <w:right w:val="single" w:sz="4" w:color="999999"/>
+            </w:tcBorders>
           </w:tcPr>
           <w:p>
             <w:r/>
@@ -3137,6 +3777,12 @@
         <w:tc>
           <w:tcPr>
             <w:tcW w:type="dxa" w:w="2880"/>
+            <w:tcBorders>
+              <w:top w:val="single" w:sz="4" w:color="999999"/>
+              <w:left w:val="single" w:sz="4" w:color="999999"/>
+              <w:bottom w:val="single" w:sz="4" w:color="999999"/>
+              <w:right w:val="single" w:sz="4" w:color="999999"/>
+            </w:tcBorders>
           </w:tcPr>
           <w:p>
             <w:r/>
@@ -3160,6 +3806,12 @@
         <w:tc>
           <w:tcPr>
             <w:tcW w:type="dxa" w:w="2880"/>
+            <w:tcBorders>
+              <w:top w:val="single" w:sz="4" w:color="999999"/>
+              <w:left w:val="single" w:sz="4" w:color="999999"/>
+              <w:bottom w:val="single" w:sz="4" w:color="999999"/>
+              <w:right w:val="single" w:sz="4" w:color="999999"/>
+            </w:tcBorders>
           </w:tcPr>
           <w:p>
             <w:r/>
@@ -3171,6 +3823,12 @@
         <w:tc>
           <w:tcPr>
             <w:tcW w:type="dxa" w:w="2880"/>
+            <w:tcBorders>
+              <w:top w:val="single" w:sz="4" w:color="999999"/>
+              <w:left w:val="single" w:sz="4" w:color="999999"/>
+              <w:bottom w:val="single" w:sz="4" w:color="999999"/>
+              <w:right w:val="single" w:sz="4" w:color="999999"/>
+            </w:tcBorders>
           </w:tcPr>
           <w:p>
             <w:r/>
@@ -3185,6 +3843,12 @@
         <w:tc>
           <w:tcPr>
             <w:tcW w:type="dxa" w:w="2880"/>
+            <w:tcBorders>
+              <w:top w:val="single" w:sz="4" w:color="999999"/>
+              <w:left w:val="single" w:sz="4" w:color="999999"/>
+              <w:bottom w:val="single" w:sz="4" w:color="999999"/>
+              <w:right w:val="single" w:sz="4" w:color="999999"/>
+            </w:tcBorders>
           </w:tcPr>
           <w:p>
             <w:r/>
@@ -3207,6 +3871,12 @@
         <w:tc>
           <w:tcPr>
             <w:tcW w:type="dxa" w:w="2880"/>
+            <w:tcBorders>
+              <w:top w:val="single" w:sz="4" w:color="999999"/>
+              <w:left w:val="single" w:sz="4" w:color="999999"/>
+              <w:bottom w:val="single" w:sz="4" w:color="999999"/>
+              <w:right w:val="single" w:sz="4" w:color="999999"/>
+            </w:tcBorders>
           </w:tcPr>
           <w:p>
             <w:r/>
@@ -3218,6 +3888,12 @@
         <w:tc>
           <w:tcPr>
             <w:tcW w:type="dxa" w:w="2880"/>
+            <w:tcBorders>
+              <w:top w:val="single" w:sz="4" w:color="999999"/>
+              <w:left w:val="single" w:sz="4" w:color="999999"/>
+              <w:bottom w:val="single" w:sz="4" w:color="999999"/>
+              <w:right w:val="single" w:sz="4" w:color="999999"/>
+            </w:tcBorders>
           </w:tcPr>
           <w:p>
             <w:r/>
@@ -3235,6 +3911,12 @@
         <w:tc>
           <w:tcPr>
             <w:tcW w:type="dxa" w:w="2880"/>
+            <w:tcBorders>
+              <w:top w:val="single" w:sz="4" w:color="999999"/>
+              <w:left w:val="single" w:sz="4" w:color="999999"/>
+              <w:bottom w:val="single" w:sz="4" w:color="999999"/>
+              <w:right w:val="single" w:sz="4" w:color="999999"/>
+            </w:tcBorders>
           </w:tcPr>
           <w:p>
             <w:r/>
@@ -3278,6 +3960,12 @@
         <w:tc>
           <w:tcPr>
             <w:tcW w:type="dxa" w:w="2880"/>
+            <w:tcBorders>
+              <w:top w:val="single" w:sz="4" w:color="999999"/>
+              <w:left w:val="single" w:sz="4" w:color="999999"/>
+              <w:bottom w:val="single" w:sz="4" w:color="999999"/>
+              <w:right w:val="single" w:sz="4" w:color="999999"/>
+            </w:tcBorders>
           </w:tcPr>
           <w:p>
             <w:r/>
@@ -3289,6 +3977,12 @@
         <w:tc>
           <w:tcPr>
             <w:tcW w:type="dxa" w:w="2880"/>
+            <w:tcBorders>
+              <w:top w:val="single" w:sz="4" w:color="999999"/>
+              <w:left w:val="single" w:sz="4" w:color="999999"/>
+              <w:bottom w:val="single" w:sz="4" w:color="999999"/>
+              <w:right w:val="single" w:sz="4" w:color="999999"/>
+            </w:tcBorders>
           </w:tcPr>
           <w:p>
             <w:r/>
@@ -3316,6 +4010,12 @@
         <w:tc>
           <w:tcPr>
             <w:tcW w:type="dxa" w:w="2880"/>
+            <w:tcBorders>
+              <w:top w:val="single" w:sz="4" w:color="999999"/>
+              <w:left w:val="single" w:sz="4" w:color="999999"/>
+              <w:bottom w:val="single" w:sz="4" w:color="999999"/>
+              <w:right w:val="single" w:sz="4" w:color="999999"/>
+            </w:tcBorders>
           </w:tcPr>
           <w:p>
             <w:r/>
@@ -3329,6 +4029,12 @@
         <w:tc>
           <w:tcPr>
             <w:tcW w:type="dxa" w:w="2880"/>
+            <w:tcBorders>
+              <w:top w:val="single" w:sz="4" w:color="999999"/>
+              <w:left w:val="single" w:sz="4" w:color="999999"/>
+              <w:bottom w:val="single" w:sz="4" w:color="999999"/>
+              <w:right w:val="single" w:sz="4" w:color="999999"/>
+            </w:tcBorders>
           </w:tcPr>
           <w:p>
             <w:r/>
@@ -3340,6 +4046,12 @@
         <w:tc>
           <w:tcPr>
             <w:tcW w:type="dxa" w:w="2880"/>
+            <w:tcBorders>
+              <w:top w:val="single" w:sz="4" w:color="999999"/>
+              <w:left w:val="single" w:sz="4" w:color="999999"/>
+              <w:bottom w:val="single" w:sz="4" w:color="999999"/>
+              <w:right w:val="single" w:sz="4" w:color="999999"/>
+            </w:tcBorders>
           </w:tcPr>
           <w:p>
             <w:r/>
@@ -3357,6 +4069,12 @@
         <w:tc>
           <w:tcPr>
             <w:tcW w:type="dxa" w:w="2880"/>
+            <w:tcBorders>
+              <w:top w:val="single" w:sz="4" w:color="999999"/>
+              <w:left w:val="single" w:sz="4" w:color="999999"/>
+              <w:bottom w:val="single" w:sz="4" w:color="999999"/>
+              <w:right w:val="single" w:sz="4" w:color="999999"/>
+            </w:tcBorders>
           </w:tcPr>
           <w:p>
             <w:r/>
@@ -3380,6 +4098,12 @@
         <w:tc>
           <w:tcPr>
             <w:tcW w:type="dxa" w:w="2880"/>
+            <w:tcBorders>
+              <w:top w:val="single" w:sz="4" w:color="999999"/>
+              <w:left w:val="single" w:sz="4" w:color="999999"/>
+              <w:bottom w:val="single" w:sz="4" w:color="999999"/>
+              <w:right w:val="single" w:sz="4" w:color="999999"/>
+            </w:tcBorders>
           </w:tcPr>
           <w:p>
             <w:r/>
@@ -3391,6 +4115,12 @@
         <w:tc>
           <w:tcPr>
             <w:tcW w:type="dxa" w:w="2880"/>
+            <w:tcBorders>
+              <w:top w:val="single" w:sz="4" w:color="999999"/>
+              <w:left w:val="single" w:sz="4" w:color="999999"/>
+              <w:bottom w:val="single" w:sz="4" w:color="999999"/>
+              <w:right w:val="single" w:sz="4" w:color="999999"/>
+            </w:tcBorders>
           </w:tcPr>
           <w:p>
             <w:r/>
@@ -3405,6 +4135,12 @@
         <w:tc>
           <w:tcPr>
             <w:tcW w:type="dxa" w:w="2880"/>
+            <w:tcBorders>
+              <w:top w:val="single" w:sz="4" w:color="999999"/>
+              <w:left w:val="single" w:sz="4" w:color="999999"/>
+              <w:bottom w:val="single" w:sz="4" w:color="999999"/>
+              <w:right w:val="single" w:sz="4" w:color="999999"/>
+            </w:tcBorders>
           </w:tcPr>
           <w:p>
             <w:r/>
@@ -3418,6 +4154,12 @@
         <w:tc>
           <w:tcPr>
             <w:tcW w:type="dxa" w:w="2880"/>
+            <w:tcBorders>
+              <w:top w:val="single" w:sz="4" w:color="999999"/>
+              <w:left w:val="single" w:sz="4" w:color="999999"/>
+              <w:bottom w:val="single" w:sz="4" w:color="999999"/>
+              <w:right w:val="single" w:sz="4" w:color="999999"/>
+            </w:tcBorders>
           </w:tcPr>
           <w:p>
             <w:r/>
@@ -3429,6 +4171,12 @@
         <w:tc>
           <w:tcPr>
             <w:tcW w:type="dxa" w:w="2880"/>
+            <w:tcBorders>
+              <w:top w:val="single" w:sz="4" w:color="999999"/>
+              <w:left w:val="single" w:sz="4" w:color="999999"/>
+              <w:bottom w:val="single" w:sz="4" w:color="999999"/>
+              <w:right w:val="single" w:sz="4" w:color="999999"/>
+            </w:tcBorders>
           </w:tcPr>
           <w:p>
             <w:r/>
@@ -3443,6 +4191,12 @@
         <w:tc>
           <w:tcPr>
             <w:tcW w:type="dxa" w:w="2880"/>
+            <w:tcBorders>
+              <w:top w:val="single" w:sz="4" w:color="999999"/>
+              <w:left w:val="single" w:sz="4" w:color="999999"/>
+              <w:bottom w:val="single" w:sz="4" w:color="999999"/>
+              <w:right w:val="single" w:sz="4" w:color="999999"/>
+            </w:tcBorders>
           </w:tcPr>
           <w:p>
             <w:r/>
@@ -3456,6 +4210,12 @@
         <w:tc>
           <w:tcPr>
             <w:tcW w:type="dxa" w:w="2880"/>
+            <w:tcBorders>
+              <w:top w:val="single" w:sz="4" w:color="999999"/>
+              <w:left w:val="single" w:sz="4" w:color="999999"/>
+              <w:bottom w:val="single" w:sz="4" w:color="999999"/>
+              <w:right w:val="single" w:sz="4" w:color="999999"/>
+            </w:tcBorders>
           </w:tcPr>
           <w:p>
             <w:r/>
@@ -3467,6 +4227,12 @@
         <w:tc>
           <w:tcPr>
             <w:tcW w:type="dxa" w:w="2880"/>
+            <w:tcBorders>
+              <w:top w:val="single" w:sz="4" w:color="999999"/>
+              <w:left w:val="single" w:sz="4" w:color="999999"/>
+              <w:bottom w:val="single" w:sz="4" w:color="999999"/>
+              <w:right w:val="single" w:sz="4" w:color="999999"/>
+            </w:tcBorders>
           </w:tcPr>
           <w:p>
             <w:r/>
@@ -3481,6 +4247,12 @@
         <w:tc>
           <w:tcPr>
             <w:tcW w:type="dxa" w:w="2880"/>
+            <w:tcBorders>
+              <w:top w:val="single" w:sz="4" w:color="999999"/>
+              <w:left w:val="single" w:sz="4" w:color="999999"/>
+              <w:bottom w:val="single" w:sz="4" w:color="999999"/>
+              <w:right w:val="single" w:sz="4" w:color="999999"/>
+            </w:tcBorders>
           </w:tcPr>
           <w:p>
             <w:r/>
@@ -3503,6 +4275,12 @@
         <w:tc>
           <w:tcPr>
             <w:tcW w:type="dxa" w:w="2880"/>
+            <w:tcBorders>
+              <w:top w:val="single" w:sz="4" w:color="999999"/>
+              <w:left w:val="single" w:sz="4" w:color="999999"/>
+              <w:bottom w:val="single" w:sz="4" w:color="999999"/>
+              <w:right w:val="single" w:sz="4" w:color="999999"/>
+            </w:tcBorders>
           </w:tcPr>
           <w:p>
             <w:r/>
@@ -3514,6 +4292,12 @@
         <w:tc>
           <w:tcPr>
             <w:tcW w:type="dxa" w:w="2880"/>
+            <w:tcBorders>
+              <w:top w:val="single" w:sz="4" w:color="999999"/>
+              <w:left w:val="single" w:sz="4" w:color="999999"/>
+              <w:bottom w:val="single" w:sz="4" w:color="999999"/>
+              <w:right w:val="single" w:sz="4" w:color="999999"/>
+            </w:tcBorders>
           </w:tcPr>
           <w:p>
             <w:r/>
@@ -3528,6 +4312,12 @@
         <w:tc>
           <w:tcPr>
             <w:tcW w:type="dxa" w:w="2880"/>
+            <w:tcBorders>
+              <w:top w:val="single" w:sz="4" w:color="999999"/>
+              <w:left w:val="single" w:sz="4" w:color="999999"/>
+              <w:bottom w:val="single" w:sz="4" w:color="999999"/>
+              <w:right w:val="single" w:sz="4" w:color="999999"/>
+            </w:tcBorders>
           </w:tcPr>
           <w:p>
             <w:r/>
@@ -3541,6 +4331,12 @@
         <w:tc>
           <w:tcPr>
             <w:tcW w:type="dxa" w:w="2880"/>
+            <w:tcBorders>
+              <w:top w:val="single" w:sz="4" w:color="999999"/>
+              <w:left w:val="single" w:sz="4" w:color="999999"/>
+              <w:bottom w:val="single" w:sz="4" w:color="999999"/>
+              <w:right w:val="single" w:sz="4" w:color="999999"/>
+            </w:tcBorders>
           </w:tcPr>
           <w:p>
             <w:r/>
@@ -3552,6 +4348,12 @@
         <w:tc>
           <w:tcPr>
             <w:tcW w:type="dxa" w:w="2880"/>
+            <w:tcBorders>
+              <w:top w:val="single" w:sz="4" w:color="999999"/>
+              <w:left w:val="single" w:sz="4" w:color="999999"/>
+              <w:bottom w:val="single" w:sz="4" w:color="999999"/>
+              <w:right w:val="single" w:sz="4" w:color="999999"/>
+            </w:tcBorders>
           </w:tcPr>
           <w:p>
             <w:r/>
@@ -3569,6 +4371,12 @@
         <w:tc>
           <w:tcPr>
             <w:tcW w:type="dxa" w:w="2880"/>
+            <w:tcBorders>
+              <w:top w:val="single" w:sz="4" w:color="999999"/>
+              <w:left w:val="single" w:sz="4" w:color="999999"/>
+              <w:bottom w:val="single" w:sz="4" w:color="999999"/>
+              <w:right w:val="single" w:sz="4" w:color="999999"/>
+            </w:tcBorders>
           </w:tcPr>
           <w:p>
             <w:r/>
@@ -3592,6 +4400,12 @@
         <w:tc>
           <w:tcPr>
             <w:tcW w:type="dxa" w:w="2880"/>
+            <w:tcBorders>
+              <w:top w:val="single" w:sz="4" w:color="999999"/>
+              <w:left w:val="single" w:sz="4" w:color="999999"/>
+              <w:bottom w:val="single" w:sz="4" w:color="999999"/>
+              <w:right w:val="single" w:sz="4" w:color="999999"/>
+            </w:tcBorders>
           </w:tcPr>
           <w:p>
             <w:r/>
@@ -3603,6 +4417,12 @@
         <w:tc>
           <w:tcPr>
             <w:tcW w:type="dxa" w:w="2880"/>
+            <w:tcBorders>
+              <w:top w:val="single" w:sz="4" w:color="999999"/>
+              <w:left w:val="single" w:sz="4" w:color="999999"/>
+              <w:bottom w:val="single" w:sz="4" w:color="999999"/>
+              <w:right w:val="single" w:sz="4" w:color="999999"/>
+            </w:tcBorders>
           </w:tcPr>
           <w:p>
             <w:r/>
@@ -3617,6 +4437,12 @@
         <w:tc>
           <w:tcPr>
             <w:tcW w:type="dxa" w:w="2880"/>
+            <w:tcBorders>
+              <w:top w:val="single" w:sz="4" w:color="999999"/>
+              <w:left w:val="single" w:sz="4" w:color="999999"/>
+              <w:bottom w:val="single" w:sz="4" w:color="999999"/>
+              <w:right w:val="single" w:sz="4" w:color="999999"/>
+            </w:tcBorders>
           </w:tcPr>
           <w:p>
             <w:r/>
@@ -3648,16 +4474,8 @@
     </w:tbl>
     <w:p/>
     <w:p>
-      <w:r>
-        <w:rPr>
-          <w:color w:val="BBBBBB"/>
-        </w:rPr>
-        <w:t>________________________________________</w:t>
-      </w:r>
-    </w:p>
-    <w:p>
       <w:pPr>
-        <w:pStyle w:val="Heading1"/>
+        <w:pStyle w:val="Heading2"/>
       </w:pPr>
       <w:r>
         <w:t>8. Resolved review comments (Caitlin's doc feedback)</w:t>
@@ -3665,7 +4483,7 @@
     </w:p>
     <w:tbl>
       <w:tblPr>
-        <w:tblStyle w:val="LightGrid-Accent1"/>
+        <w:tblStyle w:val="TableGrid"/>
         <w:tblW w:type="auto" w:w="0"/>
         <w:tblLook w:firstColumn="1" w:firstRow="1" w:lastColumn="0" w:lastRow="0" w:noHBand="0" w:noVBand="1" w:val="04A0"/>
       </w:tblPr>
@@ -3677,6 +4495,12 @@
         <w:tc>
           <w:tcPr>
             <w:tcW w:type="dxa" w:w="4320"/>
+            <w:tcBorders>
+              <w:top w:val="single" w:sz="4" w:color="999999"/>
+              <w:left w:val="single" w:sz="4" w:color="999999"/>
+              <w:bottom w:val="single" w:sz="4" w:color="999999"/>
+              <w:right w:val="single" w:sz="4" w:color="999999"/>
+            </w:tcBorders>
           </w:tcPr>
           <w:p>
             <w:r>
@@ -3695,6 +4519,12 @@
         <w:tc>
           <w:tcPr>
             <w:tcW w:type="dxa" w:w="4320"/>
+            <w:tcBorders>
+              <w:top w:val="single" w:sz="4" w:color="999999"/>
+              <w:left w:val="single" w:sz="4" w:color="999999"/>
+              <w:bottom w:val="single" w:sz="4" w:color="999999"/>
+              <w:right w:val="single" w:sz="4" w:color="999999"/>
+            </w:tcBorders>
           </w:tcPr>
           <w:p>
             <w:r>
@@ -3715,6 +4545,12 @@
         <w:tc>
           <w:tcPr>
             <w:tcW w:type="dxa" w:w="4320"/>
+            <w:tcBorders>
+              <w:top w:val="single" w:sz="4" w:color="999999"/>
+              <w:left w:val="single" w:sz="4" w:color="999999"/>
+              <w:bottom w:val="single" w:sz="4" w:color="999999"/>
+              <w:right w:val="single" w:sz="4" w:color="999999"/>
+            </w:tcBorders>
           </w:tcPr>
           <w:p>
             <w:r/>
@@ -3726,6 +4562,12 @@
         <w:tc>
           <w:tcPr>
             <w:tcW w:type="dxa" w:w="4320"/>
+            <w:tcBorders>
+              <w:top w:val="single" w:sz="4" w:color="999999"/>
+              <w:left w:val="single" w:sz="4" w:color="999999"/>
+              <w:bottom w:val="single" w:sz="4" w:color="999999"/>
+              <w:right w:val="single" w:sz="4" w:color="999999"/>
+            </w:tcBorders>
           </w:tcPr>
           <w:p>
             <w:r/>
@@ -3767,6 +4609,12 @@
         <w:tc>
           <w:tcPr>
             <w:tcW w:type="dxa" w:w="4320"/>
+            <w:tcBorders>
+              <w:top w:val="single" w:sz="4" w:color="999999"/>
+              <w:left w:val="single" w:sz="4" w:color="999999"/>
+              <w:bottom w:val="single" w:sz="4" w:color="999999"/>
+              <w:right w:val="single" w:sz="4" w:color="999999"/>
+            </w:tcBorders>
           </w:tcPr>
           <w:p>
             <w:r/>
@@ -3788,6 +4636,12 @@
         <w:tc>
           <w:tcPr>
             <w:tcW w:type="dxa" w:w="4320"/>
+            <w:tcBorders>
+              <w:top w:val="single" w:sz="4" w:color="999999"/>
+              <w:left w:val="single" w:sz="4" w:color="999999"/>
+              <w:bottom w:val="single" w:sz="4" w:color="999999"/>
+              <w:right w:val="single" w:sz="4" w:color="999999"/>
+            </w:tcBorders>
           </w:tcPr>
           <w:p>
             <w:r/>
@@ -3801,6 +4655,12 @@
         <w:tc>
           <w:tcPr>
             <w:tcW w:type="dxa" w:w="4320"/>
+            <w:tcBorders>
+              <w:top w:val="single" w:sz="4" w:color="999999"/>
+              <w:left w:val="single" w:sz="4" w:color="999999"/>
+              <w:bottom w:val="single" w:sz="4" w:color="999999"/>
+              <w:right w:val="single" w:sz="4" w:color="999999"/>
+            </w:tcBorders>
           </w:tcPr>
           <w:p>
             <w:r/>
@@ -3812,6 +4672,12 @@
         <w:tc>
           <w:tcPr>
             <w:tcW w:type="dxa" w:w="4320"/>
+            <w:tcBorders>
+              <w:top w:val="single" w:sz="4" w:color="999999"/>
+              <w:left w:val="single" w:sz="4" w:color="999999"/>
+              <w:bottom w:val="single" w:sz="4" w:color="999999"/>
+              <w:right w:val="single" w:sz="4" w:color="999999"/>
+            </w:tcBorders>
           </w:tcPr>
           <w:p>
             <w:r/>
@@ -3825,6 +4691,12 @@
         <w:tc>
           <w:tcPr>
             <w:tcW w:type="dxa" w:w="4320"/>
+            <w:tcBorders>
+              <w:top w:val="single" w:sz="4" w:color="999999"/>
+              <w:left w:val="single" w:sz="4" w:color="999999"/>
+              <w:bottom w:val="single" w:sz="4" w:color="999999"/>
+              <w:right w:val="single" w:sz="4" w:color="999999"/>
+            </w:tcBorders>
           </w:tcPr>
           <w:p>
             <w:r/>
@@ -3836,6 +4708,12 @@
         <w:tc>
           <w:tcPr>
             <w:tcW w:type="dxa" w:w="4320"/>
+            <w:tcBorders>
+              <w:top w:val="single" w:sz="4" w:color="999999"/>
+              <w:left w:val="single" w:sz="4" w:color="999999"/>
+              <w:bottom w:val="single" w:sz="4" w:color="999999"/>
+              <w:right w:val="single" w:sz="4" w:color="999999"/>
+            </w:tcBorders>
           </w:tcPr>
           <w:p>
             <w:r/>
@@ -3849,6 +4727,12 @@
         <w:tc>
           <w:tcPr>
             <w:tcW w:type="dxa" w:w="4320"/>
+            <w:tcBorders>
+              <w:top w:val="single" w:sz="4" w:color="999999"/>
+              <w:left w:val="single" w:sz="4" w:color="999999"/>
+              <w:bottom w:val="single" w:sz="4" w:color="999999"/>
+              <w:right w:val="single" w:sz="4" w:color="999999"/>
+            </w:tcBorders>
           </w:tcPr>
           <w:p>
             <w:r/>
@@ -3860,6 +4744,12 @@
         <w:tc>
           <w:tcPr>
             <w:tcW w:type="dxa" w:w="4320"/>
+            <w:tcBorders>
+              <w:top w:val="single" w:sz="4" w:color="999999"/>
+              <w:left w:val="single" w:sz="4" w:color="999999"/>
+              <w:bottom w:val="single" w:sz="4" w:color="999999"/>
+              <w:right w:val="single" w:sz="4" w:color="999999"/>
+            </w:tcBorders>
           </w:tcPr>
           <w:p>
             <w:r/>
@@ -3873,6 +4763,12 @@
         <w:tc>
           <w:tcPr>
             <w:tcW w:type="dxa" w:w="4320"/>
+            <w:tcBorders>
+              <w:top w:val="single" w:sz="4" w:color="999999"/>
+              <w:left w:val="single" w:sz="4" w:color="999999"/>
+              <w:bottom w:val="single" w:sz="4" w:color="999999"/>
+              <w:right w:val="single" w:sz="4" w:color="999999"/>
+            </w:tcBorders>
           </w:tcPr>
           <w:p>
             <w:r/>
@@ -3884,6 +4780,12 @@
         <w:tc>
           <w:tcPr>
             <w:tcW w:type="dxa" w:w="4320"/>
+            <w:tcBorders>
+              <w:top w:val="single" w:sz="4" w:color="999999"/>
+              <w:left w:val="single" w:sz="4" w:color="999999"/>
+              <w:bottom w:val="single" w:sz="4" w:color="999999"/>
+              <w:right w:val="single" w:sz="4" w:color="999999"/>
+            </w:tcBorders>
           </w:tcPr>
           <w:p>
             <w:r/>
@@ -3896,16 +4798,8 @@
     </w:tbl>
     <w:p/>
     <w:p>
-      <w:r>
-        <w:rPr>
-          <w:color w:val="BBBBBB"/>
-        </w:rPr>
-        <w:t>________________________________________</w:t>
-      </w:r>
-    </w:p>
-    <w:p>
       <w:pPr>
-        <w:pStyle w:val="Heading1"/>
+        <w:pStyle w:val="Heading2"/>
       </w:pPr>
       <w:r>
         <w:t>9. Automation plan (in build)</w:t>
@@ -4219,16 +5113,8 @@
       </w:r>
     </w:p>
     <w:p>
-      <w:r>
-        <w:rPr>
-          <w:color w:val="BBBBBB"/>
-        </w:rPr>
-        <w:t>________________________________________</w:t>
-      </w:r>
-    </w:p>
-    <w:p>
       <w:pPr>
-        <w:pStyle w:val="Heading1"/>
+        <w:pStyle w:val="Heading2"/>
       </w:pPr>
       <w:r>
         <w:t>10. Roadmap / open items</w:t>
@@ -4236,7 +5122,7 @@
     </w:p>
     <w:tbl>
       <w:tblPr>
-        <w:tblStyle w:val="LightGrid-Accent1"/>
+        <w:tblStyle w:val="TableGrid"/>
         <w:tblW w:type="auto" w:w="0"/>
         <w:tblLook w:firstColumn="1" w:firstRow="1" w:lastColumn="0" w:lastRow="0" w:noHBand="0" w:noVBand="1" w:val="04A0"/>
       </w:tblPr>
@@ -4248,6 +5134,12 @@
         <w:tc>
           <w:tcPr>
             <w:tcW w:type="dxa" w:w="4320"/>
+            <w:tcBorders>
+              <w:top w:val="single" w:sz="4" w:color="999999"/>
+              <w:left w:val="single" w:sz="4" w:color="999999"/>
+              <w:bottom w:val="single" w:sz="4" w:color="999999"/>
+              <w:right w:val="single" w:sz="4" w:color="999999"/>
+            </w:tcBorders>
           </w:tcPr>
           <w:p>
             <w:r>
@@ -4266,6 +5158,12 @@
         <w:tc>
           <w:tcPr>
             <w:tcW w:type="dxa" w:w="4320"/>
+            <w:tcBorders>
+              <w:top w:val="single" w:sz="4" w:color="999999"/>
+              <w:left w:val="single" w:sz="4" w:color="999999"/>
+              <w:bottom w:val="single" w:sz="4" w:color="999999"/>
+              <w:right w:val="single" w:sz="4" w:color="999999"/>
+            </w:tcBorders>
           </w:tcPr>
           <w:p>
             <w:r>
@@ -4286,6 +5184,12 @@
         <w:tc>
           <w:tcPr>
             <w:tcW w:type="dxa" w:w="4320"/>
+            <w:tcBorders>
+              <w:top w:val="single" w:sz="4" w:color="999999"/>
+              <w:left w:val="single" w:sz="4" w:color="999999"/>
+              <w:bottom w:val="single" w:sz="4" w:color="999999"/>
+              <w:right w:val="single" w:sz="4" w:color="999999"/>
+            </w:tcBorders>
           </w:tcPr>
           <w:p>
             <w:r/>
@@ -4297,6 +5201,12 @@
         <w:tc>
           <w:tcPr>
             <w:tcW w:type="dxa" w:w="4320"/>
+            <w:tcBorders>
+              <w:top w:val="single" w:sz="4" w:color="999999"/>
+              <w:left w:val="single" w:sz="4" w:color="999999"/>
+              <w:bottom w:val="single" w:sz="4" w:color="999999"/>
+              <w:right w:val="single" w:sz="4" w:color="999999"/>
+            </w:tcBorders>
           </w:tcPr>
           <w:p>
             <w:r/>
@@ -4319,6 +5229,12 @@
         <w:tc>
           <w:tcPr>
             <w:tcW w:type="dxa" w:w="4320"/>
+            <w:tcBorders>
+              <w:top w:val="single" w:sz="4" w:color="999999"/>
+              <w:left w:val="single" w:sz="4" w:color="999999"/>
+              <w:bottom w:val="single" w:sz="4" w:color="999999"/>
+              <w:right w:val="single" w:sz="4" w:color="999999"/>
+            </w:tcBorders>
           </w:tcPr>
           <w:p>
             <w:r/>
@@ -4330,6 +5246,12 @@
         <w:tc>
           <w:tcPr>
             <w:tcW w:type="dxa" w:w="4320"/>
+            <w:tcBorders>
+              <w:top w:val="single" w:sz="4" w:color="999999"/>
+              <w:left w:val="single" w:sz="4" w:color="999999"/>
+              <w:bottom w:val="single" w:sz="4" w:color="999999"/>
+              <w:right w:val="single" w:sz="4" w:color="999999"/>
+            </w:tcBorders>
           </w:tcPr>
           <w:p>
             <w:r/>
@@ -4343,6 +5265,12 @@
         <w:tc>
           <w:tcPr>
             <w:tcW w:type="dxa" w:w="4320"/>
+            <w:tcBorders>
+              <w:top w:val="single" w:sz="4" w:color="999999"/>
+              <w:left w:val="single" w:sz="4" w:color="999999"/>
+              <w:bottom w:val="single" w:sz="4" w:color="999999"/>
+              <w:right w:val="single" w:sz="4" w:color="999999"/>
+            </w:tcBorders>
           </w:tcPr>
           <w:p>
             <w:r/>
@@ -4354,6 +5282,12 @@
         <w:tc>
           <w:tcPr>
             <w:tcW w:type="dxa" w:w="4320"/>
+            <w:tcBorders>
+              <w:top w:val="single" w:sz="4" w:color="999999"/>
+              <w:left w:val="single" w:sz="4" w:color="999999"/>
+              <w:bottom w:val="single" w:sz="4" w:color="999999"/>
+              <w:right w:val="single" w:sz="4" w:color="999999"/>
+            </w:tcBorders>
           </w:tcPr>
           <w:p>
             <w:r/>
@@ -4386,6 +5320,12 @@
         <w:tc>
           <w:tcPr>
             <w:tcW w:type="dxa" w:w="4320"/>
+            <w:tcBorders>
+              <w:top w:val="single" w:sz="4" w:color="999999"/>
+              <w:left w:val="single" w:sz="4" w:color="999999"/>
+              <w:bottom w:val="single" w:sz="4" w:color="999999"/>
+              <w:right w:val="single" w:sz="4" w:color="999999"/>
+            </w:tcBorders>
           </w:tcPr>
           <w:p>
             <w:r/>
@@ -4397,6 +5337,12 @@
         <w:tc>
           <w:tcPr>
             <w:tcW w:type="dxa" w:w="4320"/>
+            <w:tcBorders>
+              <w:top w:val="single" w:sz="4" w:color="999999"/>
+              <w:left w:val="single" w:sz="4" w:color="999999"/>
+              <w:bottom w:val="single" w:sz="4" w:color="999999"/>
+              <w:right w:val="single" w:sz="4" w:color="999999"/>
+            </w:tcBorders>
           </w:tcPr>
           <w:p>
             <w:r/>
@@ -4410,6 +5356,12 @@
         <w:tc>
           <w:tcPr>
             <w:tcW w:type="dxa" w:w="4320"/>
+            <w:tcBorders>
+              <w:top w:val="single" w:sz="4" w:color="999999"/>
+              <w:left w:val="single" w:sz="4" w:color="999999"/>
+              <w:bottom w:val="single" w:sz="4" w:color="999999"/>
+              <w:right w:val="single" w:sz="4" w:color="999999"/>
+            </w:tcBorders>
           </w:tcPr>
           <w:p>
             <w:r/>
@@ -4421,6 +5373,12 @@
         <w:tc>
           <w:tcPr>
             <w:tcW w:type="dxa" w:w="4320"/>
+            <w:tcBorders>
+              <w:top w:val="single" w:sz="4" w:color="999999"/>
+              <w:left w:val="single" w:sz="4" w:color="999999"/>
+              <w:bottom w:val="single" w:sz="4" w:color="999999"/>
+              <w:right w:val="single" w:sz="4" w:color="999999"/>
+            </w:tcBorders>
           </w:tcPr>
           <w:p>
             <w:r/>
@@ -4434,6 +5392,12 @@
         <w:tc>
           <w:tcPr>
             <w:tcW w:type="dxa" w:w="4320"/>
+            <w:tcBorders>
+              <w:top w:val="single" w:sz="4" w:color="999999"/>
+              <w:left w:val="single" w:sz="4" w:color="999999"/>
+              <w:bottom w:val="single" w:sz="4" w:color="999999"/>
+              <w:right w:val="single" w:sz="4" w:color="999999"/>
+            </w:tcBorders>
           </w:tcPr>
           <w:p>
             <w:r/>
@@ -4445,6 +5409,12 @@
         <w:tc>
           <w:tcPr>
             <w:tcW w:type="dxa" w:w="4320"/>
+            <w:tcBorders>
+              <w:top w:val="single" w:sz="4" w:color="999999"/>
+              <w:left w:val="single" w:sz="4" w:color="999999"/>
+              <w:bottom w:val="single" w:sz="4" w:color="999999"/>
+              <w:right w:val="single" w:sz="4" w:color="999999"/>
+            </w:tcBorders>
           </w:tcPr>
           <w:p>
             <w:r/>
@@ -4457,16 +5427,8 @@
     </w:tbl>
     <w:p/>
     <w:p>
-      <w:r>
-        <w:rPr>
-          <w:color w:val="BBBBBB"/>
-        </w:rPr>
-        <w:t>________________________________________</w:t>
-      </w:r>
-    </w:p>
-    <w:p>
       <w:pPr>
-        <w:pStyle w:val="Heading1"/>
+        <w:pStyle w:val="Heading2"/>
       </w:pPr>
       <w:r>
         <w:t>11. Guardrails (non-negotiable)</w:t>

</xml_diff>